<commit_message>
added the docx and pdf and htlm files
</commit_message>
<xml_diff>
--- a/_manuscript/index.docx
+++ b/_manuscript/index.docx
@@ -39,7 +39,7 @@
         <w:pStyle w:val="Abstract"/>
       </w:pPr>
       <w:r>
-        <w:t xml:space="preserve">This manuscript discusses the relationship between public transportation and rideshare frequency based on employment status and whether the individual had access to a vehicle.</w:t>
+        <w:t xml:space="preserve">The primary purpose of this manuscript is to learn and develop the skills and tools specific to Quarto documents. The simple 2x2 anova was used to examine the relationship between employment status, vehicle access, and total number of days per month an individual uses public transportation or rideshare.</w:t>
       </w:r>
     </w:p>
     <w:sdt>
@@ -82,7 +82,7 @@
         <w:pStyle w:val="FirstParagraph"/>
       </w:pPr>
       <w:r>
-        <w:t xml:space="preserve">The type of transportation an individual chooses to use is influenced by a variety of factors, including employment status and access to a vehicle. Workers in America typically drive a personal vehicle to work</w:t>
+        <w:t xml:space="preserve">The type of transportation an individual chooses to use is influenced by a variety of factors, including employment status and access to a vehicle. Workers in America typically drive a personal vehicle to work everyday</w:t>
       </w:r>
       <w:r>
         <w:t xml:space="preserve"> </w:t>
@@ -91,7 +91,7 @@
         <w:t xml:space="preserve">(Yang et al. 2015)</w:t>
       </w:r>
       <w:r>
-        <w:t xml:space="preserve">.</w:t>
+        <w:t xml:space="preserve">. However, public transportation is also commonly used to commute to work, and rideshare services like Uber and Lyft have become increasingly popular in recent years.</w:t>
       </w:r>
     </w:p>
     <w:p>
@@ -99,7 +99,7 @@
         <w:pStyle w:val="BodyText"/>
       </w:pPr>
       <w:r>
-        <w:t xml:space="preserve">A full-time employee working in the office will have to be in the office 20-22 days per month, while part-time employees, contract employees, and retirees will not need to commute as frequently. Because full time employees are required to be somewhere more days of the week than other types of employment, I hypothesize that the sum of their total public transportation days per month and rideshare days per month will be higher than those who are not full-time employed. I also hypothesize that access to a vehicle will decrease the total number of public transportaion and rideshare rides. I hypothesize that access to a vehicle will have a stronger effect on the number of public transportation and rideshare rides for individuals not employed full-time.</w:t>
+        <w:t xml:space="preserve">Access to a vehicle greatly reduces the need for public transportation and rideshare services. I hypothesize that access to a vehicle will decrease the total number of public transportation and rideshare rides for both full-time employees and individuals with other employment statuses. The null hypothesis is that there is no difference in transportation usage between individuals with and without access to a vehicle.</w:t>
       </w:r>
     </w:p>
     <w:p>
@@ -107,7 +107,7 @@
         <w:pStyle w:val="BodyText"/>
       </w:pPr>
       <w:r>
-        <w:t xml:space="preserve">Transportation use and frequency varies based on num between full-time employed individuals and those who are not employed full-time. In this study, I examine public transportation and rideshare usage patterns between these two groups.</w:t>
+        <w:t xml:space="preserve">A full-time employee that works from the office need to commute to the office 20-22 days per month, while part-time employees, contractors, and retirees will not need to commute as frequently. I hypothesize that full-time employed individuals will have higher transportation usage than those with other types of employment status whether or not they have access to a vehicle. The null hypothesis is that there is no difference in transportation usage between full-time employed individuals and those with other types of employment status.</w:t>
       </w:r>
     </w:p>
     <w:p>
@@ -115,17 +115,37 @@
         <w:pStyle w:val="BodyText"/>
       </w:pPr>
       <w:r>
-        <w:t xml:space="preserve">In addition, having access to a vehicle can impact transportation choices, and I hypothesize that access to a vehicle will decrease the # of days per month that individuals use public transportation or rideshare services.</w:t>
+        <w:t xml:space="preserve">I hypothesize that the effect of having access to a vehicle on total public transportation and rideshare days per month will be stronger for non-full-time employees.</w:t>
+      </w:r>
+      <w:r>
+        <w:t xml:space="preserve"> </w:t>
+      </w:r>
+      <w:r>
+        <w:rPr>
+          <w:b/>
+          <w:bCs/>
+          <w:i/>
+          <w:iCs/>
+        </w:rPr>
+        <w:t xml:space="preserve">This is an interaction effect that I should look into more; currently not in the paper</w:t>
       </w:r>
     </w:p>
     <w:bookmarkEnd w:id="9"/>
-    <w:bookmarkStart w:id="37" w:name="data-and-methods"/>
+    <w:bookmarkStart w:id="31" w:name="data-and-methods"/>
     <w:p>
       <w:pPr>
         <w:pStyle w:val="Heading1"/>
       </w:pPr>
       <w:r>
         <w:t xml:space="preserve">Data and Methods</w:t>
+      </w:r>
+    </w:p>
+    <w:p>
+      <w:pPr>
+        <w:pStyle w:val="FirstParagraph"/>
+      </w:pPr>
+      <w:r>
+        <w:t xml:space="preserve">The data was provided by professor Adam Nelson, PhD, at the University of Wisconsin, Madison for the students enrolled in the Data Science in Human Behavior masters program.</w:t>
       </w:r>
     </w:p>
     <w:bookmarkStart w:id="11" w:name="load-packages-data"/>
@@ -3003,7 +3023,7 @@
         <w:pStyle w:val="BodyText"/>
       </w:pPr>
       <w:r>
-        <w:t xml:space="preserve">I created a new particpant ID as an index that was simplified from the original dataset. This was done to make the data easier to work with and to avoid issues with the long string of numbers in the original participant ID.</w:t>
+        <w:t xml:space="preserve">Participant IDs from the original data set were long complicated strings of letters and numbers. I created a new simplified particpant ID as an index and removed the old long string column.</w:t>
       </w:r>
     </w:p>
     <w:p>
@@ -3011,7 +3031,7 @@
         <w:pStyle w:val="BodyText"/>
       </w:pPr>
       <w:r>
-        <w:t xml:space="preserve">I then dropped the columns in the data set that I was not using for my analysis.</w:t>
+        <w:t xml:space="preserve">Following some EDA, I noticed 2 participants completed the survey in less than 30 seconds. That is an unreasonably short amount of time to answer all of the questions, so I removed those participants from the data set, as their responses will not be accurate.</w:t>
       </w:r>
     </w:p>
     <w:p>
@@ -3019,7 +3039,76 @@
         <w:pStyle w:val="BodyText"/>
       </w:pPr>
       <w:r>
-        <w:t xml:space="preserve">There were 2 participants that completed the survey in less than 30 seconds, so I dropped them from the dataset because their values would not be accurate.</w:t>
+        <w:t xml:space="preserve">Next I reviewed my independent variables</w:t>
+      </w:r>
+      <w:r>
+        <w:t xml:space="preserve"> </w:t>
+      </w:r>
+      <w:r>
+        <w:rPr>
+          <w:rStyle w:val="VerbatimChar"/>
+        </w:rPr>
+        <w:t xml:space="preserve">Car Access</w:t>
+      </w:r>
+      <w:r>
+        <w:t xml:space="preserve"> </w:t>
+      </w:r>
+      <w:r>
+        <w:t xml:space="preserve">and</w:t>
+      </w:r>
+      <w:r>
+        <w:t xml:space="preserve"> </w:t>
+      </w:r>
+      <w:r>
+        <w:rPr>
+          <w:rStyle w:val="VerbatimChar"/>
+        </w:rPr>
+        <w:t xml:space="preserve">Employment status</w:t>
+      </w:r>
+      <w:r>
+        <w:t xml:space="preserve">. To simplify my analysis, I converted</w:t>
+      </w:r>
+      <w:r>
+        <w:t xml:space="preserve"> </w:t>
+      </w:r>
+      <w:r>
+        <w:rPr>
+          <w:rStyle w:val="VerbatimChar"/>
+        </w:rPr>
+        <w:t xml:space="preserve">Car Access</w:t>
+      </w:r>
+      <w:r>
+        <w:t xml:space="preserve"> </w:t>
+      </w:r>
+      <w:r>
+        <w:t xml:space="preserve">into a binary variable (yes/no) and</w:t>
+      </w:r>
+      <w:r>
+        <w:t xml:space="preserve"> </w:t>
+      </w:r>
+      <w:r>
+        <w:rPr>
+          <w:rStyle w:val="VerbatimChar"/>
+        </w:rPr>
+        <w:t xml:space="preserve">Employment status</w:t>
+      </w:r>
+      <w:r>
+        <w:t xml:space="preserve"> </w:t>
+      </w:r>
+      <w:r>
+        <w:t xml:space="preserve">into a binary variable (full-time/other). There was one participant with</w:t>
+      </w:r>
+      <w:r>
+        <w:t xml:space="preserve"> </w:t>
+      </w:r>
+      <w:r>
+        <w:t xml:space="preserve">“Not Sure”</w:t>
+      </w:r>
+      <w:r>
+        <w:t xml:space="preserve"> </w:t>
+      </w:r>
+      <w:r>
+        <w:t xml:space="preserve">as their response for access to a vehicle, so they were removed from the data set. Participants that listed part-time or other employment status were combined into other employment status.</w:t>
       </w:r>
     </w:p>
     <w:p>
@@ -3027,34 +3116,22 @@
         <w:pStyle w:val="BodyText"/>
       </w:pPr>
       <w:r>
-        <w:t xml:space="preserve">I converted the rideshare days per month and the public transportation days per month variables into numeric values (0-4) and renamed the columns to be more descriptive. One participant reported</w:t>
+        <w:t xml:space="preserve">My dependent variable</w:t>
       </w:r>
       <w:r>
         <w:t xml:space="preserve"> </w:t>
       </w:r>
       <w:r>
-        <w:t xml:space="preserve">‘Not Sure’</w:t>
+        <w:rPr>
+          <w:rStyle w:val="VerbatimChar"/>
+        </w:rPr>
+        <w:t xml:space="preserve">total_rides</w:t>
       </w:r>
       <w:r>
         <w:t xml:space="preserve"> </w:t>
       </w:r>
       <w:r>
-        <w:t xml:space="preserve">for acess to a vehicle, so I removed them from the data set. Employment status was simplified to a binary variable (full-time or other). I created my dependent variable</w:t>
-      </w:r>
-      <w:r>
-        <w:t xml:space="preserve"> </w:t>
-      </w:r>
-      <w:r>
-        <w:rPr>
-          <w:rStyle w:val="VerbatimChar"/>
-        </w:rPr>
-        <w:t xml:space="preserve">total_rides</w:t>
-      </w:r>
-      <w:r>
-        <w:t xml:space="preserve"> </w:t>
-      </w:r>
-      <w:r>
-        <w:t xml:space="preserve">by summing the</w:t>
+        <w:t xml:space="preserve">was created by summing the</w:t>
       </w:r>
       <w:r>
         <w:t xml:space="preserve"> </w:t>
@@ -3092,7 +3169,15 @@
         <w:pStyle w:val="BodyText"/>
       </w:pPr>
       <w:r>
-        <w:t xml:space="preserve">The final cleaned dataset contains 270.participants. Model assumptions were checked in the</w:t>
+        <w:t xml:space="preserve">Finally, I dropped the variables in the data set that are not used in this analysis. The final cleaned dataset contains 270.participant responses.</w:t>
+      </w:r>
+    </w:p>
+    <w:p>
+      <w:pPr>
+        <w:pStyle w:val="BodyText"/>
+      </w:pPr>
+      <w:r>
+        <w:t xml:space="preserve">Model assumptions were checked in the</w:t>
       </w:r>
       <w:r>
         <w:t xml:space="preserve"> </w:t>
@@ -3214,7 +3299,7 @@
     </w:p>
     <w:bookmarkEnd w:id="16"/>
     <w:bookmarkEnd w:id="17"/>
-    <w:bookmarkStart w:id="36" w:name="descriptive-statistics"/>
+    <w:bookmarkStart w:id="29" w:name="descriptive-statistics"/>
     <w:p>
       <w:pPr>
         <w:pStyle w:val="Heading2"/>
@@ -4901,9 +4986,87 @@
       </w:pPr>
       <w:r>
         <w:rPr>
+          <w:rStyle w:val="ImportTok"/>
+        </w:rPr>
+        <w:t xml:space="preserve">import</w:t>
+      </w:r>
+      <w:r>
+        <w:rPr>
+          <w:rStyle w:val="NormalTok"/>
+        </w:rPr>
+        <w:t xml:space="preserve"> pandas </w:t>
+      </w:r>
+      <w:r>
+        <w:rPr>
+          <w:rStyle w:val="ImportTok"/>
+        </w:rPr>
+        <w:t xml:space="preserve">as</w:t>
+      </w:r>
+      <w:r>
+        <w:rPr>
+          <w:rStyle w:val="NormalTok"/>
+        </w:rPr>
+        <w:t xml:space="preserve"> pd</w:t>
+      </w:r>
+      <w:r>
+        <w:br/>
+      </w:r>
+      <w:r>
+        <w:rPr>
+          <w:rStyle w:val="ImportTok"/>
+        </w:rPr>
+        <w:t xml:space="preserve">from</w:t>
+      </w:r>
+      <w:r>
+        <w:rPr>
+          <w:rStyle w:val="NormalTok"/>
+        </w:rPr>
+        <w:t xml:space="preserve"> IPython.display </w:t>
+      </w:r>
+      <w:r>
+        <w:rPr>
+          <w:rStyle w:val="ImportTok"/>
+        </w:rPr>
+        <w:t xml:space="preserve">import</w:t>
+      </w:r>
+      <w:r>
+        <w:rPr>
+          <w:rStyle w:val="NormalTok"/>
+        </w:rPr>
+        <w:t xml:space="preserve"> display</w:t>
+      </w:r>
+      <w:r>
+        <w:br/>
+      </w:r>
+      <w:r>
+        <w:br/>
+      </w:r>
+      <w:r>
+        <w:rPr>
           <w:rStyle w:val="CommentTok"/>
         </w:rPr>
-        <w:t xml:space="preserve"># Create a mapping of employment status values to human-readable descriptions</w:t>
+        <w:t xml:space="preserve"># -----------------------------</w:t>
+      </w:r>
+      <w:r>
+        <w:br/>
+      </w:r>
+      <w:r>
+        <w:rPr>
+          <w:rStyle w:val="CommentTok"/>
+        </w:rPr>
+        <w:t xml:space="preserve"># Employment status</w:t>
+      </w:r>
+      <w:r>
+        <w:br/>
+      </w:r>
+      <w:r>
+        <w:rPr>
+          <w:rStyle w:val="CommentTok"/>
+        </w:rPr>
+        <w:t xml:space="preserve"># -----------------------------</w:t>
+      </w:r>
+      <w:r>
+        <w:br/>
       </w:r>
       <w:r>
         <w:br/>
@@ -5003,18 +5166,330 @@
       </w:r>
       <w:r>
         <w:rPr>
+          <w:rStyle w:val="NormalTok"/>
+        </w:rPr>
+        <w:t xml:space="preserve">employ_counts </w:t>
+      </w:r>
+      <w:r>
+        <w:rPr>
+          <w:rStyle w:val="OperatorTok"/>
+        </w:rPr>
+        <w:t xml:space="preserve">=</w:t>
+      </w:r>
+      <w:r>
+        <w:rPr>
+          <w:rStyle w:val="NormalTok"/>
+        </w:rPr>
+        <w:t xml:space="preserve"> df[</w:t>
+      </w:r>
+      <w:r>
+        <w:rPr>
+          <w:rStyle w:val="StringTok"/>
+        </w:rPr>
+        <w:t xml:space="preserve">'Full-Time'</w:t>
+      </w:r>
+      <w:r>
+        <w:rPr>
+          <w:rStyle w:val="NormalTok"/>
+        </w:rPr>
+        <w:t xml:space="preserve">].value_counts()</w:t>
+      </w:r>
+      <w:r>
+        <w:br/>
+      </w:r>
+      <w:r>
+        <w:br/>
+      </w:r>
+      <w:r>
+        <w:rPr>
+          <w:rStyle w:val="NormalTok"/>
+        </w:rPr>
+        <w:t xml:space="preserve">employ_tbl </w:t>
+      </w:r>
+      <w:r>
+        <w:rPr>
+          <w:rStyle w:val="OperatorTok"/>
+        </w:rPr>
+        <w:t xml:space="preserve">=</w:t>
+      </w:r>
+      <w:r>
+        <w:rPr>
+          <w:rStyle w:val="NormalTok"/>
+        </w:rPr>
+        <w:t xml:space="preserve"> pd.DataFrame({</w:t>
+      </w:r>
+      <w:r>
+        <w:rPr>
+          <w:rStyle w:val="StringTok"/>
+        </w:rPr>
+        <w:t xml:space="preserve">'count'</w:t>
+      </w:r>
+      <w:r>
+        <w:rPr>
+          <w:rStyle w:val="NormalTok"/>
+        </w:rPr>
+        <w:t xml:space="preserve">: employ_counts})</w:t>
+      </w:r>
+      <w:r>
+        <w:br/>
+      </w:r>
+      <w:r>
+        <w:br/>
+      </w:r>
+      <w:r>
+        <w:rPr>
+          <w:rStyle w:val="NormalTok"/>
+        </w:rPr>
+        <w:t xml:space="preserve">employ_tbl[</w:t>
+      </w:r>
+      <w:r>
+        <w:rPr>
+          <w:rStyle w:val="StringTok"/>
+        </w:rPr>
+        <w:t xml:space="preserve">'Employment'</w:t>
+      </w:r>
+      <w:r>
+        <w:rPr>
+          <w:rStyle w:val="NormalTok"/>
+        </w:rPr>
+        <w:t xml:space="preserve">] </w:t>
+      </w:r>
+      <w:r>
+        <w:rPr>
+          <w:rStyle w:val="OperatorTok"/>
+        </w:rPr>
+        <w:t xml:space="preserve">=</w:t>
+      </w:r>
+      <w:r>
+        <w:rPr>
+          <w:rStyle w:val="NormalTok"/>
+        </w:rPr>
+        <w:t xml:space="preserve"> employ_tbl.index.</w:t>
+      </w:r>
+      <w:r>
+        <w:rPr>
+          <w:rStyle w:val="BuiltInTok"/>
+        </w:rPr>
+        <w:t xml:space="preserve">map</w:t>
+      </w:r>
+      <w:r>
+        <w:rPr>
+          <w:rStyle w:val="NormalTok"/>
+        </w:rPr>
+        <w:t xml:space="preserve">(</w:t>
+      </w:r>
+      <w:r>
+        <w:br/>
+      </w:r>
+      <w:r>
+        <w:rPr>
+          <w:rStyle w:val="NormalTok"/>
+        </w:rPr>
+        <w:t xml:space="preserve">    employment_descriptions</w:t>
+      </w:r>
+      <w:r>
+        <w:br/>
+      </w:r>
+      <w:r>
+        <w:rPr>
+          <w:rStyle w:val="NormalTok"/>
+        </w:rPr>
+        <w:t xml:space="preserve">)</w:t>
+      </w:r>
+      <w:r>
+        <w:br/>
+      </w:r>
+      <w:r>
+        <w:br/>
+      </w:r>
+      <w:r>
+        <w:rPr>
+          <w:rStyle w:val="NormalTok"/>
+        </w:rPr>
+        <w:t xml:space="preserve">employ_tbl </w:t>
+      </w:r>
+      <w:r>
+        <w:rPr>
+          <w:rStyle w:val="OperatorTok"/>
+        </w:rPr>
+        <w:t xml:space="preserve">=</w:t>
+      </w:r>
+      <w:r>
+        <w:rPr>
+          <w:rStyle w:val="NormalTok"/>
+        </w:rPr>
+        <w:t xml:space="preserve"> (</w:t>
+      </w:r>
+      <w:r>
+        <w:br/>
+      </w:r>
+      <w:r>
+        <w:rPr>
+          <w:rStyle w:val="NormalTok"/>
+        </w:rPr>
+        <w:t xml:space="preserve">    employ_tbl</w:t>
+      </w:r>
+      <w:r>
+        <w:br/>
+      </w:r>
+      <w:r>
+        <w:rPr>
+          <w:rStyle w:val="NormalTok"/>
+        </w:rPr>
+        <w:t xml:space="preserve">    .reset_index(drop</w:t>
+      </w:r>
+      <w:r>
+        <w:rPr>
+          <w:rStyle w:val="OperatorTok"/>
+        </w:rPr>
+        <w:t xml:space="preserve">=</w:t>
+      </w:r>
+      <w:r>
+        <w:rPr>
+          <w:rStyle w:val="VariableTok"/>
+        </w:rPr>
+        <w:t xml:space="preserve">True</w:t>
+      </w:r>
+      <w:r>
+        <w:rPr>
+          <w:rStyle w:val="NormalTok"/>
+        </w:rPr>
+        <w:t xml:space="preserve">)</w:t>
+      </w:r>
+      <w:r>
+        <w:br/>
+      </w:r>
+      <w:r>
+        <w:rPr>
+          <w:rStyle w:val="NormalTok"/>
+        </w:rPr>
+        <w:t xml:space="preserve">    .set_index(</w:t>
+      </w:r>
+      <w:r>
+        <w:rPr>
+          <w:rStyle w:val="StringTok"/>
+        </w:rPr>
+        <w:t xml:space="preserve">'Employment'</w:t>
+      </w:r>
+      <w:r>
+        <w:rPr>
+          <w:rStyle w:val="NormalTok"/>
+        </w:rPr>
+        <w:t xml:space="preserve">)</w:t>
+      </w:r>
+      <w:r>
+        <w:br/>
+      </w:r>
+      <w:r>
+        <w:rPr>
+          <w:rStyle w:val="NormalTok"/>
+        </w:rPr>
+        <w:t xml:space="preserve">)</w:t>
+      </w:r>
+      <w:r>
+        <w:br/>
+      </w:r>
+      <w:r>
+        <w:br/>
+      </w:r>
+      <w:r>
+        <w:rPr>
+          <w:rStyle w:val="NormalTok"/>
+        </w:rPr>
+        <w:t xml:space="preserve">employ_tbl.loc[</w:t>
+      </w:r>
+      <w:r>
+        <w:rPr>
+          <w:rStyle w:val="StringTok"/>
+        </w:rPr>
+        <w:t xml:space="preserve">'Total'</w:t>
+      </w:r>
+      <w:r>
+        <w:rPr>
+          <w:rStyle w:val="NormalTok"/>
+        </w:rPr>
+        <w:t xml:space="preserve">] </w:t>
+      </w:r>
+      <w:r>
+        <w:rPr>
+          <w:rStyle w:val="OperatorTok"/>
+        </w:rPr>
+        <w:t xml:space="preserve">=</w:t>
+      </w:r>
+      <w:r>
+        <w:rPr>
+          <w:rStyle w:val="NormalTok"/>
+        </w:rPr>
+        <w:t xml:space="preserve"> employ_tbl[</w:t>
+      </w:r>
+      <w:r>
+        <w:rPr>
+          <w:rStyle w:val="StringTok"/>
+        </w:rPr>
+        <w:t xml:space="preserve">'count'</w:t>
+      </w:r>
+      <w:r>
+        <w:rPr>
+          <w:rStyle w:val="NormalTok"/>
+        </w:rPr>
+        <w:t xml:space="preserve">].</w:t>
+      </w:r>
+      <w:r>
+        <w:rPr>
+          <w:rStyle w:val="BuiltInTok"/>
+        </w:rPr>
+        <w:t xml:space="preserve">sum</w:t>
+      </w:r>
+      <w:r>
+        <w:rPr>
+          <w:rStyle w:val="NormalTok"/>
+        </w:rPr>
+        <w:t xml:space="preserve">()</w:t>
+      </w:r>
+      <w:r>
+        <w:br/>
+      </w:r>
+      <w:r>
+        <w:br/>
+      </w:r>
+      <w:r>
+        <w:br/>
+      </w:r>
+      <w:r>
+        <w:rPr>
           <w:rStyle w:val="CommentTok"/>
         </w:rPr>
-        <w:t xml:space="preserve"># Get the value counts</w:t>
-      </w:r>
-      <w:r>
-        <w:br/>
-      </w:r>
-      <w:r>
-        <w:rPr>
-          <w:rStyle w:val="NormalTok"/>
-        </w:rPr>
-        <w:t xml:space="preserve">employ_counts </w:t>
+        <w:t xml:space="preserve"># -----------------------------</w:t>
+      </w:r>
+      <w:r>
+        <w:br/>
+      </w:r>
+      <w:r>
+        <w:rPr>
+          <w:rStyle w:val="CommentTok"/>
+        </w:rPr>
+        <w:t xml:space="preserve"># Vehicle access</w:t>
+      </w:r>
+      <w:r>
+        <w:br/>
+      </w:r>
+      <w:r>
+        <w:rPr>
+          <w:rStyle w:val="CommentTok"/>
+        </w:rPr>
+        <w:t xml:space="preserve"># -----------------------------</w:t>
+      </w:r>
+      <w:r>
+        <w:br/>
+      </w:r>
+      <w:r>
+        <w:br/>
+      </w:r>
+      <w:r>
+        <w:rPr>
+          <w:rStyle w:val="NormalTok"/>
+        </w:rPr>
+        <w:t xml:space="preserve">VehicleAccess </w:t>
       </w:r>
       <w:r>
         <w:rPr>
@@ -5026,13 +5501,106 @@
         <w:rPr>
           <w:rStyle w:val="NormalTok"/>
         </w:rPr>
+        <w:t xml:space="preserve"> {</w:t>
+      </w:r>
+      <w:r>
+        <w:br/>
+      </w:r>
+      <w:r>
+        <w:rPr>
+          <w:rStyle w:val="NormalTok"/>
+        </w:rPr>
+        <w:t xml:space="preserve">    </w:t>
+      </w:r>
+      <w:r>
+        <w:rPr>
+          <w:rStyle w:val="StringTok"/>
+        </w:rPr>
+        <w:t xml:space="preserve">'Yes'</w:t>
+      </w:r>
+      <w:r>
+        <w:rPr>
+          <w:rStyle w:val="NormalTok"/>
+        </w:rPr>
+        <w:t xml:space="preserve">: </w:t>
+      </w:r>
+      <w:r>
+        <w:rPr>
+          <w:rStyle w:val="StringTok"/>
+        </w:rPr>
+        <w:t xml:space="preserve">'Has Access to Vehicle'</w:t>
+      </w:r>
+      <w:r>
+        <w:rPr>
+          <w:rStyle w:val="NormalTok"/>
+        </w:rPr>
+        <w:t xml:space="preserve">,</w:t>
+      </w:r>
+      <w:r>
+        <w:br/>
+      </w:r>
+      <w:r>
+        <w:rPr>
+          <w:rStyle w:val="NormalTok"/>
+        </w:rPr>
+        <w:t xml:space="preserve">    </w:t>
+      </w:r>
+      <w:r>
+        <w:rPr>
+          <w:rStyle w:val="StringTok"/>
+        </w:rPr>
+        <w:t xml:space="preserve">'No'</w:t>
+      </w:r>
+      <w:r>
+        <w:rPr>
+          <w:rStyle w:val="NormalTok"/>
+        </w:rPr>
+        <w:t xml:space="preserve">: </w:t>
+      </w:r>
+      <w:r>
+        <w:rPr>
+          <w:rStyle w:val="StringTok"/>
+        </w:rPr>
+        <w:t xml:space="preserve">'No Access to Vehicle'</w:t>
+      </w:r>
+      <w:r>
+        <w:br/>
+      </w:r>
+      <w:r>
+        <w:rPr>
+          <w:rStyle w:val="NormalTok"/>
+        </w:rPr>
+        <w:t xml:space="preserve">}</w:t>
+      </w:r>
+      <w:r>
+        <w:br/>
+      </w:r>
+      <w:r>
+        <w:br/>
+      </w:r>
+      <w:r>
+        <w:rPr>
+          <w:rStyle w:val="NormalTok"/>
+        </w:rPr>
+        <w:t xml:space="preserve">car_counts </w:t>
+      </w:r>
+      <w:r>
+        <w:rPr>
+          <w:rStyle w:val="OperatorTok"/>
+        </w:rPr>
+        <w:t xml:space="preserve">=</w:t>
+      </w:r>
+      <w:r>
+        <w:rPr>
+          <w:rStyle w:val="NormalTok"/>
+        </w:rPr>
         <w:t xml:space="preserve"> df[</w:t>
       </w:r>
       <w:r>
         <w:rPr>
           <w:rStyle w:val="StringTok"/>
         </w:rPr>
-        <w:t xml:space="preserve">'Full-Time'</w:t>
+        <w:t xml:space="preserve">'Car Access'</w:t>
       </w:r>
       <w:r>
         <w:rPr>
@@ -5048,9 +5616,285 @@
       </w:r>
       <w:r>
         <w:rPr>
+          <w:rStyle w:val="NormalTok"/>
+        </w:rPr>
+        <w:t xml:space="preserve">car_tbl </w:t>
+      </w:r>
+      <w:r>
+        <w:rPr>
+          <w:rStyle w:val="OperatorTok"/>
+        </w:rPr>
+        <w:t xml:space="preserve">=</w:t>
+      </w:r>
+      <w:r>
+        <w:rPr>
+          <w:rStyle w:val="NormalTok"/>
+        </w:rPr>
+        <w:t xml:space="preserve"> pd.DataFrame({</w:t>
+      </w:r>
+      <w:r>
+        <w:rPr>
+          <w:rStyle w:val="StringTok"/>
+        </w:rPr>
+        <w:t xml:space="preserve">'count'</w:t>
+      </w:r>
+      <w:r>
+        <w:rPr>
+          <w:rStyle w:val="NormalTok"/>
+        </w:rPr>
+        <w:t xml:space="preserve">: car_counts})</w:t>
+      </w:r>
+      <w:r>
+        <w:br/>
+      </w:r>
+      <w:r>
+        <w:br/>
+      </w:r>
+      <w:r>
+        <w:rPr>
+          <w:rStyle w:val="NormalTok"/>
+        </w:rPr>
+        <w:t xml:space="preserve">car_tbl[</w:t>
+      </w:r>
+      <w:r>
+        <w:rPr>
+          <w:rStyle w:val="StringTok"/>
+        </w:rPr>
+        <w:t xml:space="preserve">'Vehicle Access'</w:t>
+      </w:r>
+      <w:r>
+        <w:rPr>
+          <w:rStyle w:val="NormalTok"/>
+        </w:rPr>
+        <w:t xml:space="preserve">] </w:t>
+      </w:r>
+      <w:r>
+        <w:rPr>
+          <w:rStyle w:val="OperatorTok"/>
+        </w:rPr>
+        <w:t xml:space="preserve">=</w:t>
+      </w:r>
+      <w:r>
+        <w:rPr>
+          <w:rStyle w:val="NormalTok"/>
+        </w:rPr>
+        <w:t xml:space="preserve"> car_tbl.index.</w:t>
+      </w:r>
+      <w:r>
+        <w:rPr>
+          <w:rStyle w:val="BuiltInTok"/>
+        </w:rPr>
+        <w:t xml:space="preserve">map</w:t>
+      </w:r>
+      <w:r>
+        <w:rPr>
+          <w:rStyle w:val="NormalTok"/>
+        </w:rPr>
+        <w:t xml:space="preserve">(</w:t>
+      </w:r>
+      <w:r>
+        <w:br/>
+      </w:r>
+      <w:r>
+        <w:rPr>
+          <w:rStyle w:val="NormalTok"/>
+        </w:rPr>
+        <w:t xml:space="preserve">    VehicleAccess</w:t>
+      </w:r>
+      <w:r>
+        <w:br/>
+      </w:r>
+      <w:r>
+        <w:rPr>
+          <w:rStyle w:val="NormalTok"/>
+        </w:rPr>
+        <w:t xml:space="preserve">)</w:t>
+      </w:r>
+      <w:r>
+        <w:br/>
+      </w:r>
+      <w:r>
+        <w:br/>
+      </w:r>
+      <w:r>
+        <w:rPr>
+          <w:rStyle w:val="NormalTok"/>
+        </w:rPr>
+        <w:t xml:space="preserve">car_tbl </w:t>
+      </w:r>
+      <w:r>
+        <w:rPr>
+          <w:rStyle w:val="OperatorTok"/>
+        </w:rPr>
+        <w:t xml:space="preserve">=</w:t>
+      </w:r>
+      <w:r>
+        <w:rPr>
+          <w:rStyle w:val="NormalTok"/>
+        </w:rPr>
+        <w:t xml:space="preserve"> (</w:t>
+      </w:r>
+      <w:r>
+        <w:br/>
+      </w:r>
+      <w:r>
+        <w:rPr>
+          <w:rStyle w:val="NormalTok"/>
+        </w:rPr>
+        <w:t xml:space="preserve">    car_tbl</w:t>
+      </w:r>
+      <w:r>
+        <w:br/>
+      </w:r>
+      <w:r>
+        <w:rPr>
+          <w:rStyle w:val="NormalTok"/>
+        </w:rPr>
+        <w:t xml:space="preserve">    .reset_index(drop</w:t>
+      </w:r>
+      <w:r>
+        <w:rPr>
+          <w:rStyle w:val="OperatorTok"/>
+        </w:rPr>
+        <w:t xml:space="preserve">=</w:t>
+      </w:r>
+      <w:r>
+        <w:rPr>
+          <w:rStyle w:val="VariableTok"/>
+        </w:rPr>
+        <w:t xml:space="preserve">True</w:t>
+      </w:r>
+      <w:r>
+        <w:rPr>
+          <w:rStyle w:val="NormalTok"/>
+        </w:rPr>
+        <w:t xml:space="preserve">)</w:t>
+      </w:r>
+      <w:r>
+        <w:br/>
+      </w:r>
+      <w:r>
+        <w:rPr>
+          <w:rStyle w:val="NormalTok"/>
+        </w:rPr>
+        <w:t xml:space="preserve">    .set_index(</w:t>
+      </w:r>
+      <w:r>
+        <w:rPr>
+          <w:rStyle w:val="StringTok"/>
+        </w:rPr>
+        <w:t xml:space="preserve">'Vehicle Access'</w:t>
+      </w:r>
+      <w:r>
+        <w:rPr>
+          <w:rStyle w:val="NormalTok"/>
+        </w:rPr>
+        <w:t xml:space="preserve">)</w:t>
+      </w:r>
+      <w:r>
+        <w:br/>
+      </w:r>
+      <w:r>
+        <w:rPr>
+          <w:rStyle w:val="NormalTok"/>
+        </w:rPr>
+        <w:t xml:space="preserve">)</w:t>
+      </w:r>
+      <w:r>
+        <w:br/>
+      </w:r>
+      <w:r>
+        <w:br/>
+      </w:r>
+      <w:r>
+        <w:rPr>
+          <w:rStyle w:val="NormalTok"/>
+        </w:rPr>
+        <w:t xml:space="preserve">car_tbl.loc[</w:t>
+      </w:r>
+      <w:r>
+        <w:rPr>
+          <w:rStyle w:val="StringTok"/>
+        </w:rPr>
+        <w:t xml:space="preserve">'Total'</w:t>
+      </w:r>
+      <w:r>
+        <w:rPr>
+          <w:rStyle w:val="NormalTok"/>
+        </w:rPr>
+        <w:t xml:space="preserve">] </w:t>
+      </w:r>
+      <w:r>
+        <w:rPr>
+          <w:rStyle w:val="OperatorTok"/>
+        </w:rPr>
+        <w:t xml:space="preserve">=</w:t>
+      </w:r>
+      <w:r>
+        <w:rPr>
+          <w:rStyle w:val="NormalTok"/>
+        </w:rPr>
+        <w:t xml:space="preserve"> car_tbl[</w:t>
+      </w:r>
+      <w:r>
+        <w:rPr>
+          <w:rStyle w:val="StringTok"/>
+        </w:rPr>
+        <w:t xml:space="preserve">'count'</w:t>
+      </w:r>
+      <w:r>
+        <w:rPr>
+          <w:rStyle w:val="NormalTok"/>
+        </w:rPr>
+        <w:t xml:space="preserve">].</w:t>
+      </w:r>
+      <w:r>
+        <w:rPr>
+          <w:rStyle w:val="BuiltInTok"/>
+        </w:rPr>
+        <w:t xml:space="preserve">sum</w:t>
+      </w:r>
+      <w:r>
+        <w:rPr>
+          <w:rStyle w:val="NormalTok"/>
+        </w:rPr>
+        <w:t xml:space="preserve">()</w:t>
+      </w:r>
+      <w:r>
+        <w:br/>
+      </w:r>
+      <w:r>
+        <w:br/>
+      </w:r>
+      <w:r>
+        <w:br/>
+      </w:r>
+      <w:r>
+        <w:rPr>
           <w:rStyle w:val="CommentTok"/>
         </w:rPr>
-        <w:t xml:space="preserve"># Create a DataFrame with the counts</w:t>
+        <w:t xml:space="preserve"># -----------------------------</w:t>
+      </w:r>
+      <w:r>
+        <w:br/>
+      </w:r>
+      <w:r>
+        <w:rPr>
+          <w:rStyle w:val="CommentTok"/>
+        </w:rPr>
+        <w:t xml:space="preserve"># Combine the two tables</w:t>
+      </w:r>
+      <w:r>
+        <w:br/>
+      </w:r>
+      <w:r>
+        <w:rPr>
+          <w:rStyle w:val="CommentTok"/>
+        </w:rPr>
+        <w:t xml:space="preserve"># -----------------------------</w:t>
+      </w:r>
+      <w:r>
+        <w:br/>
       </w:r>
       <w:r>
         <w:br/>
@@ -5071,19 +5915,28 @@
         <w:rPr>
           <w:rStyle w:val="NormalTok"/>
         </w:rPr>
-        <w:t xml:space="preserve"> pd.DataFrame({</w:t>
-      </w:r>
-      <w:r>
-        <w:rPr>
-          <w:rStyle w:val="StringTok"/>
-        </w:rPr>
-        <w:t xml:space="preserve">'count'</w:t>
-      </w:r>
-      <w:r>
-        <w:rPr>
-          <w:rStyle w:val="NormalTok"/>
-        </w:rPr>
-        <w:t xml:space="preserve">: employ_counts})</w:t>
+        <w:t xml:space="preserve"> employ_tbl.reset_index()</w:t>
+      </w:r>
+      <w:r>
+        <w:br/>
+      </w:r>
+      <w:r>
+        <w:rPr>
+          <w:rStyle w:val="NormalTok"/>
+        </w:rPr>
+        <w:t xml:space="preserve">car_tbl </w:t>
+      </w:r>
+      <w:r>
+        <w:rPr>
+          <w:rStyle w:val="OperatorTok"/>
+        </w:rPr>
+        <w:t xml:space="preserve">=</w:t>
+      </w:r>
+      <w:r>
+        <w:rPr>
+          <w:rStyle w:val="NormalTok"/>
+        </w:rPr>
+        <w:t xml:space="preserve"> car_tbl.reset_index()</w:t>
       </w:r>
       <w:r>
         <w:br/>
@@ -5095,28 +5948,16 @@
         <w:rPr>
           <w:rStyle w:val="CommentTok"/>
         </w:rPr>
-        <w:t xml:space="preserve"># Add human-readable descriptions as a new column</w:t>
-      </w:r>
-      <w:r>
-        <w:br/>
-      </w:r>
-      <w:r>
-        <w:rPr>
-          <w:rStyle w:val="NormalTok"/>
-        </w:rPr>
-        <w:t xml:space="preserve">employ_tbl[</w:t>
-      </w:r>
-      <w:r>
-        <w:rPr>
-          <w:rStyle w:val="StringTok"/>
-        </w:rPr>
-        <w:t xml:space="preserve">'Employment'</w:t>
-      </w:r>
-      <w:r>
-        <w:rPr>
-          <w:rStyle w:val="NormalTok"/>
-        </w:rPr>
-        <w:t xml:space="preserve">] </w:t>
+        <w:t xml:space="preserve"># Make the tables the same number of rows</w:t>
+      </w:r>
+      <w:r>
+        <w:br/>
+      </w:r>
+      <w:r>
+        <w:rPr>
+          <w:rStyle w:val="NormalTok"/>
+        </w:rPr>
+        <w:t xml:space="preserve">max_rows </w:t>
       </w:r>
       <w:r>
         <w:rPr>
@@ -5128,19 +5969,112 @@
         <w:rPr>
           <w:rStyle w:val="NormalTok"/>
         </w:rPr>
-        <w:t xml:space="preserve"> employ_tbl.index.</w:t>
+        <w:t xml:space="preserve"> </w:t>
       </w:r>
       <w:r>
         <w:rPr>
           <w:rStyle w:val="BuiltInTok"/>
         </w:rPr>
-        <w:t xml:space="preserve">map</w:t>
-      </w:r>
-      <w:r>
-        <w:rPr>
-          <w:rStyle w:val="NormalTok"/>
-        </w:rPr>
-        <w:t xml:space="preserve">(employment_descriptions)</w:t>
+        <w:t xml:space="preserve">max</w:t>
+      </w:r>
+      <w:r>
+        <w:rPr>
+          <w:rStyle w:val="NormalTok"/>
+        </w:rPr>
+        <w:t xml:space="preserve">(</w:t>
+      </w:r>
+      <w:r>
+        <w:rPr>
+          <w:rStyle w:val="BuiltInTok"/>
+        </w:rPr>
+        <w:t xml:space="preserve">len</w:t>
+      </w:r>
+      <w:r>
+        <w:rPr>
+          <w:rStyle w:val="NormalTok"/>
+        </w:rPr>
+        <w:t xml:space="preserve">(employ_tbl), </w:t>
+      </w:r>
+      <w:r>
+        <w:rPr>
+          <w:rStyle w:val="BuiltInTok"/>
+        </w:rPr>
+        <w:t xml:space="preserve">len</w:t>
+      </w:r>
+      <w:r>
+        <w:rPr>
+          <w:rStyle w:val="NormalTok"/>
+        </w:rPr>
+        <w:t xml:space="preserve">(car_tbl))</w:t>
+      </w:r>
+      <w:r>
+        <w:br/>
+      </w:r>
+      <w:r>
+        <w:br/>
+      </w:r>
+      <w:r>
+        <w:rPr>
+          <w:rStyle w:val="NormalTok"/>
+        </w:rPr>
+        <w:t xml:space="preserve">employ_tbl </w:t>
+      </w:r>
+      <w:r>
+        <w:rPr>
+          <w:rStyle w:val="OperatorTok"/>
+        </w:rPr>
+        <w:t xml:space="preserve">=</w:t>
+      </w:r>
+      <w:r>
+        <w:rPr>
+          <w:rStyle w:val="NormalTok"/>
+        </w:rPr>
+        <w:t xml:space="preserve"> employ_tbl.reindex(</w:t>
+      </w:r>
+      <w:r>
+        <w:rPr>
+          <w:rStyle w:val="BuiltInTok"/>
+        </w:rPr>
+        <w:t xml:space="preserve">range</w:t>
+      </w:r>
+      <w:r>
+        <w:rPr>
+          <w:rStyle w:val="NormalTok"/>
+        </w:rPr>
+        <w:t xml:space="preserve">(max_rows))</w:t>
+      </w:r>
+      <w:r>
+        <w:br/>
+      </w:r>
+      <w:r>
+        <w:rPr>
+          <w:rStyle w:val="NormalTok"/>
+        </w:rPr>
+        <w:t xml:space="preserve">car_tbl </w:t>
+      </w:r>
+      <w:r>
+        <w:rPr>
+          <w:rStyle w:val="OperatorTok"/>
+        </w:rPr>
+        <w:t xml:space="preserve">=</w:t>
+      </w:r>
+      <w:r>
+        <w:rPr>
+          <w:rStyle w:val="NormalTok"/>
+        </w:rPr>
+        <w:t xml:space="preserve"> car_tbl.reindex(</w:t>
+      </w:r>
+      <w:r>
+        <w:rPr>
+          <w:rStyle w:val="BuiltInTok"/>
+        </w:rPr>
+        <w:t xml:space="preserve">range</w:t>
+      </w:r>
+      <w:r>
+        <w:rPr>
+          <w:rStyle w:val="NormalTok"/>
+        </w:rPr>
+        <w:t xml:space="preserve">(max_rows))</w:t>
       </w:r>
       <w:r>
         <w:br/>
@@ -5152,16 +6086,16 @@
         <w:rPr>
           <w:rStyle w:val="CommentTok"/>
         </w:rPr>
-        <w:t xml:space="preserve"># Drop the existing index and set the new column as the index</w:t>
-      </w:r>
-      <w:r>
-        <w:br/>
-      </w:r>
-      <w:r>
-        <w:rPr>
-          <w:rStyle w:val="NormalTok"/>
-        </w:rPr>
-        <w:t xml:space="preserve">employ_tbl </w:t>
+        <w:t xml:space="preserve"># Rename columns</w:t>
+      </w:r>
+      <w:r>
+        <w:br/>
+      </w:r>
+      <w:r>
+        <w:rPr>
+          <w:rStyle w:val="NormalTok"/>
+        </w:rPr>
+        <w:t xml:space="preserve">employ_tbl.columns </w:t>
       </w:r>
       <w:r>
         <w:rPr>
@@ -5173,7 +6107,40 @@
         <w:rPr>
           <w:rStyle w:val="NormalTok"/>
         </w:rPr>
-        <w:t xml:space="preserve"> employ_tbl.reset_index(drop</w:t>
+        <w:t xml:space="preserve"> [</w:t>
+      </w:r>
+      <w:r>
+        <w:rPr>
+          <w:rStyle w:val="StringTok"/>
+        </w:rPr>
+        <w:t xml:space="preserve">'Employment Status'</w:t>
+      </w:r>
+      <w:r>
+        <w:rPr>
+          <w:rStyle w:val="NormalTok"/>
+        </w:rPr>
+        <w:t xml:space="preserve">, </w:t>
+      </w:r>
+      <w:r>
+        <w:rPr>
+          <w:rStyle w:val="StringTok"/>
+        </w:rPr>
+        <w:t xml:space="preserve">'Count'</w:t>
+      </w:r>
+      <w:r>
+        <w:rPr>
+          <w:rStyle w:val="NormalTok"/>
+        </w:rPr>
+        <w:t xml:space="preserve">]</w:t>
+      </w:r>
+      <w:r>
+        <w:br/>
+      </w:r>
+      <w:r>
+        <w:rPr>
+          <w:rStyle w:val="NormalTok"/>
+        </w:rPr>
+        <w:t xml:space="preserve">car_tbl.columns </w:t>
       </w:r>
       <w:r>
         <w:rPr>
@@ -5183,6 +6150,144 @@
       </w:r>
       <w:r>
         <w:rPr>
+          <w:rStyle w:val="NormalTok"/>
+        </w:rPr>
+        <w:t xml:space="preserve"> [</w:t>
+      </w:r>
+      <w:r>
+        <w:rPr>
+          <w:rStyle w:val="StringTok"/>
+        </w:rPr>
+        <w:t xml:space="preserve">'Vehicle Access'</w:t>
+      </w:r>
+      <w:r>
+        <w:rPr>
+          <w:rStyle w:val="NormalTok"/>
+        </w:rPr>
+        <w:t xml:space="preserve">, </w:t>
+      </w:r>
+      <w:r>
+        <w:rPr>
+          <w:rStyle w:val="StringTok"/>
+        </w:rPr>
+        <w:t xml:space="preserve">'Count'</w:t>
+      </w:r>
+      <w:r>
+        <w:rPr>
+          <w:rStyle w:val="NormalTok"/>
+        </w:rPr>
+        <w:t xml:space="preserve">]</w:t>
+      </w:r>
+      <w:r>
+        <w:br/>
+      </w:r>
+      <w:r>
+        <w:br/>
+      </w:r>
+      <w:r>
+        <w:rPr>
+          <w:rStyle w:val="CommentTok"/>
+        </w:rPr>
+        <w:t xml:space="preserve"># Combine side-by-side</w:t>
+      </w:r>
+      <w:r>
+        <w:br/>
+      </w:r>
+      <w:r>
+        <w:rPr>
+          <w:rStyle w:val="NormalTok"/>
+        </w:rPr>
+        <w:t xml:space="preserve">combined_tbl </w:t>
+      </w:r>
+      <w:r>
+        <w:rPr>
+          <w:rStyle w:val="OperatorTok"/>
+        </w:rPr>
+        <w:t xml:space="preserve">=</w:t>
+      </w:r>
+      <w:r>
+        <w:rPr>
+          <w:rStyle w:val="NormalTok"/>
+        </w:rPr>
+        <w:t xml:space="preserve"> pd.concat(</w:t>
+      </w:r>
+      <w:r>
+        <w:br/>
+      </w:r>
+      <w:r>
+        <w:rPr>
+          <w:rStyle w:val="NormalTok"/>
+        </w:rPr>
+        <w:t xml:space="preserve">    [employ_tbl, car_tbl],</w:t>
+      </w:r>
+      <w:r>
+        <w:br/>
+      </w:r>
+      <w:r>
+        <w:rPr>
+          <w:rStyle w:val="NormalTok"/>
+        </w:rPr>
+        <w:t xml:space="preserve">    axis</w:t>
+      </w:r>
+      <w:r>
+        <w:rPr>
+          <w:rStyle w:val="OperatorTok"/>
+        </w:rPr>
+        <w:t xml:space="preserve">=</w:t>
+      </w:r>
+      <w:r>
+        <w:rPr>
+          <w:rStyle w:val="DecValTok"/>
+        </w:rPr>
+        <w:t xml:space="preserve">1</w:t>
+      </w:r>
+      <w:r>
+        <w:br/>
+      </w:r>
+      <w:r>
+        <w:rPr>
+          <w:rStyle w:val="NormalTok"/>
+        </w:rPr>
+        <w:t xml:space="preserve">)</w:t>
+      </w:r>
+      <w:r>
+        <w:br/>
+      </w:r>
+      <w:r>
+        <w:br/>
+      </w:r>
+      <w:r>
+        <w:rPr>
+          <w:rStyle w:val="NormalTok"/>
+        </w:rPr>
+        <w:t xml:space="preserve">combined_tbl </w:t>
+      </w:r>
+      <w:r>
+        <w:rPr>
+          <w:rStyle w:val="OperatorTok"/>
+        </w:rPr>
+        <w:t xml:space="preserve">=</w:t>
+      </w:r>
+      <w:r>
+        <w:rPr>
+          <w:rStyle w:val="NormalTok"/>
+        </w:rPr>
+        <w:t xml:space="preserve"> combined_tbl.reset_index(drop </w:t>
+      </w:r>
+      <w:r>
+        <w:rPr>
+          <w:rStyle w:val="OperatorTok"/>
+        </w:rPr>
+        <w:t xml:space="preserve">=</w:t>
+      </w:r>
+      <w:r>
+        <w:rPr>
+          <w:rStyle w:val="NormalTok"/>
+        </w:rPr>
+        <w:t xml:space="preserve"> </w:t>
+      </w:r>
+      <w:r>
+        <w:rPr>
           <w:rStyle w:val="VariableTok"/>
         </w:rPr>
         <w:t xml:space="preserve">True</w:t>
@@ -5191,538 +6296,57 @@
         <w:rPr>
           <w:rStyle w:val="NormalTok"/>
         </w:rPr>
-        <w:t xml:space="preserve">).set_index(</w:t>
-      </w:r>
-      <w:r>
-        <w:rPr>
-          <w:rStyle w:val="StringTok"/>
-        </w:rPr>
-        <w:t xml:space="preserve">'Employment'</w:t>
-      </w:r>
-      <w:r>
-        <w:rPr>
-          <w:rStyle w:val="NormalTok"/>
-        </w:rPr>
         <w:t xml:space="preserve">)</w:t>
       </w:r>
       <w:r>
         <w:br/>
       </w:r>
       <w:r>
-        <w:br/>
-      </w:r>
-      <w:r>
-        <w:rPr>
-          <w:rStyle w:val="CommentTok"/>
-        </w:rPr>
-        <w:t xml:space="preserve"># Add total row</w:t>
-      </w:r>
-      <w:r>
-        <w:br/>
-      </w:r>
-      <w:r>
-        <w:rPr>
-          <w:rStyle w:val="NormalTok"/>
-        </w:rPr>
-        <w:t xml:space="preserve">employ_tbl.loc[</w:t>
-      </w:r>
-      <w:r>
-        <w:rPr>
-          <w:rStyle w:val="StringTok"/>
-        </w:rPr>
-        <w:t xml:space="preserve">'Total'</w:t>
-      </w:r>
-      <w:r>
-        <w:rPr>
-          <w:rStyle w:val="NormalTok"/>
-        </w:rPr>
-        <w:t xml:space="preserve">] </w:t>
-      </w:r>
-      <w:r>
-        <w:rPr>
-          <w:rStyle w:val="OperatorTok"/>
-        </w:rPr>
-        <w:t xml:space="preserve">=</w:t>
-      </w:r>
-      <w:r>
-        <w:rPr>
-          <w:rStyle w:val="NormalTok"/>
-        </w:rPr>
-        <w:t xml:space="preserve"> employ_tbl[</w:t>
-      </w:r>
-      <w:r>
-        <w:rPr>
-          <w:rStyle w:val="StringTok"/>
-        </w:rPr>
-        <w:t xml:space="preserve">'count'</w:t>
-      </w:r>
-      <w:r>
-        <w:rPr>
-          <w:rStyle w:val="NormalTok"/>
-        </w:rPr>
-        <w:t xml:space="preserve">].</w:t>
-      </w:r>
-      <w:r>
-        <w:rPr>
-          <w:rStyle w:val="BuiltInTok"/>
-        </w:rPr>
-        <w:t xml:space="preserve">sum</w:t>
-      </w:r>
-      <w:r>
-        <w:rPr>
-          <w:rStyle w:val="NormalTok"/>
-        </w:rPr>
-        <w:t xml:space="preserve">()</w:t>
-      </w:r>
-      <w:r>
-        <w:br/>
-      </w:r>
-      <w:r>
-        <w:br/>
-      </w:r>
-      <w:r>
-        <w:rPr>
-          <w:rStyle w:val="CommentTok"/>
-        </w:rPr>
-        <w:t xml:space="preserve"># Create a mapping of car access values to human-readable descriptions</w:t>
-      </w:r>
-      <w:r>
-        <w:br/>
-      </w:r>
-      <w:r>
-        <w:rPr>
-          <w:rStyle w:val="NormalTok"/>
-        </w:rPr>
-        <w:t xml:space="preserve">VehicleAccess </w:t>
-      </w:r>
-      <w:r>
-        <w:rPr>
-          <w:rStyle w:val="OperatorTok"/>
-        </w:rPr>
-        <w:t xml:space="preserve">=</w:t>
-      </w:r>
-      <w:r>
-        <w:rPr>
-          <w:rStyle w:val="NormalTok"/>
-        </w:rPr>
-        <w:t xml:space="preserve"> {</w:t>
-      </w:r>
-      <w:r>
-        <w:br/>
-      </w:r>
-      <w:r>
-        <w:rPr>
-          <w:rStyle w:val="NormalTok"/>
-        </w:rPr>
-        <w:t xml:space="preserve">    </w:t>
-      </w:r>
-      <w:r>
-        <w:rPr>
-          <w:rStyle w:val="StringTok"/>
-        </w:rPr>
-        <w:t xml:space="preserve">'Yes'</w:t>
-      </w:r>
-      <w:r>
-        <w:rPr>
-          <w:rStyle w:val="NormalTok"/>
-        </w:rPr>
-        <w:t xml:space="preserve">: </w:t>
-      </w:r>
-      <w:r>
-        <w:rPr>
-          <w:rStyle w:val="StringTok"/>
-        </w:rPr>
-        <w:t xml:space="preserve">'Has Access to Vehicle'</w:t>
-      </w:r>
-      <w:r>
-        <w:rPr>
-          <w:rStyle w:val="NormalTok"/>
-        </w:rPr>
-        <w:t xml:space="preserve">,</w:t>
-      </w:r>
-      <w:r>
-        <w:br/>
-      </w:r>
-      <w:r>
-        <w:rPr>
-          <w:rStyle w:val="NormalTok"/>
-        </w:rPr>
-        <w:t xml:space="preserve">    </w:t>
-      </w:r>
-      <w:r>
-        <w:rPr>
-          <w:rStyle w:val="StringTok"/>
-        </w:rPr>
-        <w:t xml:space="preserve">'No'</w:t>
-      </w:r>
-      <w:r>
-        <w:rPr>
-          <w:rStyle w:val="NormalTok"/>
-        </w:rPr>
-        <w:t xml:space="preserve">: </w:t>
-      </w:r>
-      <w:r>
-        <w:rPr>
-          <w:rStyle w:val="StringTok"/>
-        </w:rPr>
-        <w:t xml:space="preserve">'No Access to Vehicle'</w:t>
-      </w:r>
-      <w:r>
-        <w:br/>
-      </w:r>
-      <w:r>
-        <w:rPr>
-          <w:rStyle w:val="NormalTok"/>
-        </w:rPr>
-        <w:t xml:space="preserve">}</w:t>
-      </w:r>
-      <w:r>
-        <w:br/>
-      </w:r>
-      <w:r>
-        <w:br/>
-      </w:r>
-      <w:r>
-        <w:rPr>
-          <w:rStyle w:val="CommentTok"/>
-        </w:rPr>
-        <w:t xml:space="preserve"># Get the value counts</w:t>
-      </w:r>
-      <w:r>
-        <w:br/>
-      </w:r>
-      <w:r>
-        <w:rPr>
-          <w:rStyle w:val="NormalTok"/>
-        </w:rPr>
-        <w:t xml:space="preserve">car_counts </w:t>
-      </w:r>
-      <w:r>
-        <w:rPr>
-          <w:rStyle w:val="OperatorTok"/>
-        </w:rPr>
-        <w:t xml:space="preserve">=</w:t>
-      </w:r>
-      <w:r>
-        <w:rPr>
-          <w:rStyle w:val="NormalTok"/>
-        </w:rPr>
-        <w:t xml:space="preserve"> df[</w:t>
-      </w:r>
-      <w:r>
-        <w:rPr>
-          <w:rStyle w:val="StringTok"/>
-        </w:rPr>
-        <w:t xml:space="preserve">'Car Access'</w:t>
-      </w:r>
-      <w:r>
-        <w:rPr>
-          <w:rStyle w:val="NormalTok"/>
-        </w:rPr>
-        <w:t xml:space="preserve">].value_counts()</w:t>
-      </w:r>
-      <w:r>
-        <w:br/>
-      </w:r>
-      <w:r>
-        <w:br/>
-      </w:r>
-      <w:r>
-        <w:rPr>
-          <w:rStyle w:val="CommentTok"/>
-        </w:rPr>
-        <w:t xml:space="preserve"># Create a DataFrame with the counts</w:t>
-      </w:r>
-      <w:r>
-        <w:br/>
-      </w:r>
-      <w:r>
-        <w:rPr>
-          <w:rStyle w:val="NormalTok"/>
-        </w:rPr>
-        <w:t xml:space="preserve">car_tbl </w:t>
-      </w:r>
-      <w:r>
-        <w:rPr>
-          <w:rStyle w:val="OperatorTok"/>
-        </w:rPr>
-        <w:t xml:space="preserve">=</w:t>
-      </w:r>
-      <w:r>
-        <w:rPr>
-          <w:rStyle w:val="NormalTok"/>
-        </w:rPr>
-        <w:t xml:space="preserve"> pd.DataFrame({</w:t>
-      </w:r>
-      <w:r>
-        <w:rPr>
-          <w:rStyle w:val="StringTok"/>
-        </w:rPr>
-        <w:t xml:space="preserve">'count'</w:t>
-      </w:r>
-      <w:r>
-        <w:rPr>
-          <w:rStyle w:val="NormalTok"/>
-        </w:rPr>
-        <w:t xml:space="preserve">: car_counts})</w:t>
-      </w:r>
-      <w:r>
-        <w:br/>
-      </w:r>
-      <w:r>
-        <w:br/>
-      </w:r>
-      <w:r>
-        <w:rPr>
-          <w:rStyle w:val="CommentTok"/>
-        </w:rPr>
-        <w:t xml:space="preserve"># Add human-readable descriptions as a new column</w:t>
-      </w:r>
-      <w:r>
-        <w:br/>
-      </w:r>
-      <w:r>
-        <w:rPr>
-          <w:rStyle w:val="NormalTok"/>
-        </w:rPr>
-        <w:t xml:space="preserve">car_tbl[</w:t>
-      </w:r>
-      <w:r>
-        <w:rPr>
-          <w:rStyle w:val="StringTok"/>
-        </w:rPr>
-        <w:t xml:space="preserve">'Vehicle Access'</w:t>
-      </w:r>
-      <w:r>
-        <w:rPr>
-          <w:rStyle w:val="NormalTok"/>
-        </w:rPr>
-        <w:t xml:space="preserve">] </w:t>
-      </w:r>
-      <w:r>
-        <w:rPr>
-          <w:rStyle w:val="OperatorTok"/>
-        </w:rPr>
-        <w:t xml:space="preserve">=</w:t>
-      </w:r>
-      <w:r>
-        <w:rPr>
-          <w:rStyle w:val="NormalTok"/>
-        </w:rPr>
-        <w:t xml:space="preserve"> car_tbl.index.</w:t>
-      </w:r>
-      <w:r>
-        <w:rPr>
-          <w:rStyle w:val="BuiltInTok"/>
-        </w:rPr>
-        <w:t xml:space="preserve">map</w:t>
-      </w:r>
-      <w:r>
-        <w:rPr>
-          <w:rStyle w:val="NormalTok"/>
-        </w:rPr>
-        <w:t xml:space="preserve">(VehicleAccess)</w:t>
-      </w:r>
-      <w:r>
-        <w:br/>
-      </w:r>
-      <w:r>
-        <w:br/>
-      </w:r>
-      <w:r>
-        <w:rPr>
-          <w:rStyle w:val="CommentTok"/>
-        </w:rPr>
-        <w:t xml:space="preserve"># Drop the existing index and set the new column as the index</w:t>
-      </w:r>
-      <w:r>
-        <w:br/>
-      </w:r>
-      <w:r>
-        <w:rPr>
-          <w:rStyle w:val="NormalTok"/>
-        </w:rPr>
-        <w:t xml:space="preserve">car_tbl </w:t>
-      </w:r>
-      <w:r>
-        <w:rPr>
-          <w:rStyle w:val="OperatorTok"/>
-        </w:rPr>
-        <w:t xml:space="preserve">=</w:t>
-      </w:r>
-      <w:r>
-        <w:rPr>
-          <w:rStyle w:val="NormalTok"/>
-        </w:rPr>
-        <w:t xml:space="preserve"> car_tbl.reset_index(drop</w:t>
-      </w:r>
-      <w:r>
-        <w:rPr>
-          <w:rStyle w:val="OperatorTok"/>
-        </w:rPr>
-        <w:t xml:space="preserve">=</w:t>
-      </w:r>
-      <w:r>
-        <w:rPr>
-          <w:rStyle w:val="VariableTok"/>
-        </w:rPr>
-        <w:t xml:space="preserve">True</w:t>
-      </w:r>
-      <w:r>
-        <w:rPr>
-          <w:rStyle w:val="NormalTok"/>
-        </w:rPr>
-        <w:t xml:space="preserve">).set_index(</w:t>
-      </w:r>
-      <w:r>
-        <w:rPr>
-          <w:rStyle w:val="StringTok"/>
-        </w:rPr>
-        <w:t xml:space="preserve">'Vehicle Access'</w:t>
-      </w:r>
-      <w:r>
-        <w:rPr>
-          <w:rStyle w:val="NormalTok"/>
-        </w:rPr>
-        <w:t xml:space="preserve">)</w:t>
-      </w:r>
-      <w:r>
-        <w:br/>
-      </w:r>
-      <w:r>
-        <w:br/>
-      </w:r>
-      <w:r>
-        <w:rPr>
-          <w:rStyle w:val="CommentTok"/>
-        </w:rPr>
-        <w:t xml:space="preserve"># Add total row</w:t>
-      </w:r>
-      <w:r>
-        <w:br/>
-      </w:r>
-      <w:r>
-        <w:rPr>
-          <w:rStyle w:val="NormalTok"/>
-        </w:rPr>
-        <w:t xml:space="preserve">car_tbl.loc[</w:t>
-      </w:r>
-      <w:r>
-        <w:rPr>
-          <w:rStyle w:val="StringTok"/>
-        </w:rPr>
-        <w:t xml:space="preserve">'Total'</w:t>
-      </w:r>
-      <w:r>
-        <w:rPr>
-          <w:rStyle w:val="NormalTok"/>
-        </w:rPr>
-        <w:t xml:space="preserve">] </w:t>
-      </w:r>
-      <w:r>
-        <w:rPr>
-          <w:rStyle w:val="OperatorTok"/>
-        </w:rPr>
-        <w:t xml:space="preserve">=</w:t>
-      </w:r>
-      <w:r>
-        <w:rPr>
-          <w:rStyle w:val="NormalTok"/>
-        </w:rPr>
-        <w:t xml:space="preserve"> car_tbl[</w:t>
-      </w:r>
-      <w:r>
-        <w:rPr>
-          <w:rStyle w:val="StringTok"/>
-        </w:rPr>
-        <w:t xml:space="preserve">'count'</w:t>
-      </w:r>
-      <w:r>
-        <w:rPr>
-          <w:rStyle w:val="NormalTok"/>
-        </w:rPr>
-        <w:t xml:space="preserve">].</w:t>
-      </w:r>
-      <w:r>
-        <w:rPr>
-          <w:rStyle w:val="BuiltInTok"/>
-        </w:rPr>
-        <w:t xml:space="preserve">sum</w:t>
-      </w:r>
-      <w:r>
-        <w:rPr>
-          <w:rStyle w:val="NormalTok"/>
-        </w:rPr>
-        <w:t xml:space="preserve">()</w:t>
-      </w:r>
-      <w:r>
-        <w:br/>
-      </w:r>
-      <w:r>
-        <w:br/>
-      </w:r>
-      <w:r>
-        <w:rPr>
-          <w:rStyle w:val="NormalTok"/>
-        </w:rPr>
-        <w:t xml:space="preserve">display(car_tbl)</w:t>
-      </w:r>
-      <w:r>
-        <w:br/>
-      </w:r>
-      <w:r>
-        <w:br/>
-      </w:r>
-      <w:r>
-        <w:rPr>
-          <w:rStyle w:val="NormalTok"/>
-        </w:rPr>
-        <w:t xml:space="preserve">display(employ_tbl)</w:t>
+        <w:rPr>
+          <w:rStyle w:val="NormalTok"/>
+        </w:rPr>
+        <w:t xml:space="preserve">combined_tbl</w:t>
       </w:r>
     </w:p>
-    <w:bookmarkStart w:id="27" w:name="tbl-cross-tab"/>
     <w:tbl>
       <w:tblPr>
         <w:tblStyle w:val="Table"/>
-        <w:tblW w:type="pct" w:w="4900"/>
+        <w:tblW w:type="pct" w:w="5000"/>
         <w:tblLayout w:type="fixed"/>
         <w:tblLook w:firstRow="0" w:lastRow="0" w:firstColumn="0" w:lastColumn="0" w:noHBand="0" w:noVBand="0" w:val="0000"/>
       </w:tblPr>
       <w:tblGrid>
-        <w:gridCol w:w="1293"/>
-        <w:gridCol w:w="1293"/>
-        <w:gridCol w:w="1293"/>
-        <w:gridCol w:w="1293"/>
-        <w:gridCol w:w="1293"/>
-        <w:gridCol w:w="1293"/>
+        <w:gridCol w:w="7920"/>
       </w:tblGrid>
       <w:tr>
         <w:tc>
           <w:tcPr/>
-          <w:p/>
-        </w:tc>
-        <w:tc>
-          <w:tcPr/>
+          <w:bookmarkStart w:id="27" w:name="tbl-cross-tab"/>
           <w:p>
             <w:pPr>
-              <w:pStyle w:val="FirstParagraph"/>
+              <w:jc w:val="center"/>
             </w:pPr>
             <w:pPr>
-              <w:jc w:val="center"/>
+              <w:jc w:val="left"/>
               <w:spacing w:before="200"/>
               <w:pStyle w:val="ImageCaption"/>
             </w:pPr>
+            <w:r>
+              <w:t xml:space="preserve">Table 2: Value Counts of Employment Status and Car Access</w:t>
+            </w:r>
           </w:p>
           <w:tbl>
             <w:tblPr>
               <w:tblStyle w:val="Table"/>
-              <w:tblW w:type="pct" w:w="4900"/>
-              <w:tblLayout w:type="fixed"/>
+              <w:tblW w:type="auto" w:w="0"/>
               <w:tblLook w:firstRow="1" w:lastRow="0" w:firstColumn="0" w:lastColumn="0" w:noHBand="0" w:noVBand="0" w:val="0020"/>
             </w:tblPr>
             <w:tblGrid>
-              <w:gridCol w:w="3880"/>
-              <w:gridCol w:w="3880"/>
+              <w:gridCol w:w="1584"/>
+              <w:gridCol w:w="1584"/>
+              <w:gridCol w:w="1584"/>
+              <w:gridCol w:w="1584"/>
+              <w:gridCol w:w="1584"/>
             </w:tblGrid>
             <w:tr>
               <w:trPr>
@@ -5741,34 +6365,109 @@
                 <w:p>
                   <w:pPr>
                     <w:pStyle w:val="Compact"/>
-                  </w:pPr>
-                  <w:r>
-                    <w:t xml:space="preserve">count</w:t>
+                    <w:jc w:val="center"/>
+                  </w:pPr>
+                  <w:r>
+                    <w:t xml:space="preserve">Employment Status</w:t>
+                  </w:r>
+                </w:p>
+              </w:tc>
+              <w:tc>
+                <w:tcPr/>
+                <w:p>
+                  <w:pPr>
+                    <w:pStyle w:val="Compact"/>
+                    <w:jc w:val="center"/>
+                  </w:pPr>
+                  <w:r>
+                    <w:t xml:space="preserve">Count</w:t>
+                  </w:r>
+                </w:p>
+              </w:tc>
+              <w:tc>
+                <w:tcPr/>
+                <w:p>
+                  <w:pPr>
+                    <w:pStyle w:val="Compact"/>
+                    <w:jc w:val="center"/>
+                  </w:pPr>
+                  <w:r>
+                    <w:t xml:space="preserve">Vehicle Access</w:t>
+                  </w:r>
+                </w:p>
+              </w:tc>
+              <w:tc>
+                <w:tcPr/>
+                <w:p>
+                  <w:pPr>
+                    <w:pStyle w:val="Compact"/>
+                    <w:jc w:val="center"/>
+                  </w:pPr>
+                  <w:r>
+                    <w:t xml:space="preserve">Count</w:t>
                   </w:r>
                 </w:p>
               </w:tc>
             </w:tr>
             <w:tr>
-              <w:trPr>
-                <w:tblHeader w:val="on"/>
-              </w:trPr>
-              <w:tc>
-                <w:tcPr/>
-                <w:p>
-                  <w:pPr>
-                    <w:pStyle w:val="Compact"/>
-                  </w:pPr>
-                  <w:r>
-                    <w:t xml:space="preserve">Vehicle Access</w:t>
-                  </w:r>
-                </w:p>
-              </w:tc>
-              <w:tc>
-                <w:tcPr/>
-                <w:p>
-                  <w:pPr>
-                    <w:pStyle w:val="Compact"/>
-                  </w:pPr>
+              <w:tc>
+                <w:tcPr/>
+                <w:p>
+                  <w:pPr>
+                    <w:pStyle w:val="Compact"/>
+                    <w:jc w:val="center"/>
+                  </w:pPr>
+                  <w:r>
+                    <w:t xml:space="preserve">0</w:t>
+                  </w:r>
+                </w:p>
+              </w:tc>
+              <w:tc>
+                <w:tcPr/>
+                <w:p>
+                  <w:pPr>
+                    <w:pStyle w:val="Compact"/>
+                    <w:jc w:val="center"/>
+                  </w:pPr>
+                  <w:r>
+                    <w:t xml:space="preserve">Full-Time Employment</w:t>
+                  </w:r>
+                </w:p>
+              </w:tc>
+              <w:tc>
+                <w:tcPr/>
+                <w:p>
+                  <w:pPr>
+                    <w:pStyle w:val="Compact"/>
+                    <w:jc w:val="center"/>
+                  </w:pPr>
+                  <w:r>
+                    <w:t xml:space="preserve">154</w:t>
+                  </w:r>
+                </w:p>
+              </w:tc>
+              <w:tc>
+                <w:tcPr/>
+                <w:p>
+                  <w:pPr>
+                    <w:pStyle w:val="Compact"/>
+                    <w:jc w:val="center"/>
+                  </w:pPr>
+                  <w:r>
+                    <w:t xml:space="preserve">Has Access to Vehicle</w:t>
+                  </w:r>
+                </w:p>
+              </w:tc>
+              <w:tc>
+                <w:tcPr/>
+                <w:p>
+                  <w:pPr>
+                    <w:pStyle w:val="Compact"/>
+                    <w:jc w:val="center"/>
+                  </w:pPr>
+                  <w:r>
+                    <w:t xml:space="preserve">133</w:t>
+                  </w:r>
                 </w:p>
               </w:tc>
             </w:tr>
@@ -5778,20 +6477,58 @@
                 <w:p>
                   <w:pPr>
                     <w:pStyle w:val="Compact"/>
-                  </w:pPr>
-                  <w:r>
-                    <w:t xml:space="preserve">Has Access to Vehicle</w:t>
-                  </w:r>
-                </w:p>
-              </w:tc>
-              <w:tc>
-                <w:tcPr/>
-                <w:p>
-                  <w:pPr>
-                    <w:pStyle w:val="Compact"/>
-                  </w:pPr>
-                  <w:r>
-                    <w:t xml:space="preserve">133</w:t>
+                    <w:jc w:val="center"/>
+                  </w:pPr>
+                  <w:r>
+                    <w:t xml:space="preserve">1</w:t>
+                  </w:r>
+                </w:p>
+              </w:tc>
+              <w:tc>
+                <w:tcPr/>
+                <w:p>
+                  <w:pPr>
+                    <w:pStyle w:val="Compact"/>
+                    <w:jc w:val="center"/>
+                  </w:pPr>
+                  <w:r>
+                    <w:t xml:space="preserve">Other Employment Status</w:t>
+                  </w:r>
+                </w:p>
+              </w:tc>
+              <w:tc>
+                <w:tcPr/>
+                <w:p>
+                  <w:pPr>
+                    <w:pStyle w:val="Compact"/>
+                    <w:jc w:val="center"/>
+                  </w:pPr>
+                  <w:r>
+                    <w:t xml:space="preserve">97</w:t>
+                  </w:r>
+                </w:p>
+              </w:tc>
+              <w:tc>
+                <w:tcPr/>
+                <w:p>
+                  <w:pPr>
+                    <w:pStyle w:val="Compact"/>
+                    <w:jc w:val="center"/>
+                  </w:pPr>
+                  <w:r>
+                    <w:t xml:space="preserve">No Access to Vehicle</w:t>
+                  </w:r>
+                </w:p>
+              </w:tc>
+              <w:tc>
+                <w:tcPr/>
+                <w:p>
+                  <w:pPr>
+                    <w:pStyle w:val="Compact"/>
+                    <w:jc w:val="center"/>
+                  </w:pPr>
+                  <w:r>
+                    <w:t xml:space="preserve">33</w:t>
                   </w:r>
                 </w:p>
               </w:tc>
@@ -5802,30 +6539,19 @@
                 <w:p>
                   <w:pPr>
                     <w:pStyle w:val="Compact"/>
-                  </w:pPr>
-                  <w:r>
-                    <w:t xml:space="preserve">No Access to Vehicle</w:t>
-                  </w:r>
-                </w:p>
-              </w:tc>
-              <w:tc>
-                <w:tcPr/>
-                <w:p>
-                  <w:pPr>
-                    <w:pStyle w:val="Compact"/>
-                  </w:pPr>
-                  <w:r>
-                    <w:t xml:space="preserve">33</w:t>
-                  </w:r>
-                </w:p>
-              </w:tc>
-            </w:tr>
-            <w:tr>
-              <w:tc>
-                <w:tcPr/>
-                <w:p>
-                  <w:pPr>
-                    <w:pStyle w:val="Compact"/>
+                    <w:jc w:val="center"/>
+                  </w:pPr>
+                  <w:r>
+                    <w:t xml:space="preserve">2</w:t>
+                  </w:r>
+                </w:p>
+              </w:tc>
+              <w:tc>
+                <w:tcPr/>
+                <w:p>
+                  <w:pPr>
+                    <w:pStyle w:val="Compact"/>
+                    <w:jc w:val="center"/>
                   </w:pPr>
                   <w:r>
                     <w:t xml:space="preserve">Total</w:t>
@@ -5837,6 +6563,31 @@
                 <w:p>
                   <w:pPr>
                     <w:pStyle w:val="Compact"/>
+                    <w:jc w:val="center"/>
+                  </w:pPr>
+                  <w:r>
+                    <w:t xml:space="preserve">251</w:t>
+                  </w:r>
+                </w:p>
+              </w:tc>
+              <w:tc>
+                <w:tcPr/>
+                <w:p>
+                  <w:pPr>
+                    <w:pStyle w:val="Compact"/>
+                    <w:jc w:val="center"/>
+                  </w:pPr>
+                  <w:r>
+                    <w:t xml:space="preserve">Total</w:t>
+                  </w:r>
+                </w:p>
+              </w:tc>
+              <w:tc>
+                <w:tcPr/>
+                <w:p>
+                  <w:pPr>
+                    <w:pStyle w:val="Compact"/>
+                    <w:jc w:val="center"/>
                   </w:pPr>
                   <w:r>
                     <w:t xml:space="preserve">166</w:t>
@@ -5845,181 +6596,11 @@
               </w:tc>
             </w:tr>
           </w:tbl>
-          <w:p/>
-        </w:tc>
-        <w:tc>
-          <w:tcPr/>
-          <w:p/>
-        </w:tc>
-        <w:tc>
-          <w:tcPr/>
-          <w:p/>
-        </w:tc>
-        <w:tc>
-          <w:tcPr/>
-          <w:p>
-            <w:pPr>
-              <w:pStyle w:val="BodyText"/>
-            </w:pPr>
-            <w:pPr>
-              <w:jc w:val="center"/>
-              <w:spacing w:before="200"/>
-              <w:pStyle w:val="ImageCaption"/>
-            </w:pPr>
-          </w:p>
-          <w:tbl>
-            <w:tblPr>
-              <w:tblStyle w:val="Table"/>
-              <w:tblW w:type="pct" w:w="4900"/>
-              <w:tblLayout w:type="fixed"/>
-              <w:tblLook w:firstRow="1" w:lastRow="0" w:firstColumn="0" w:lastColumn="0" w:noHBand="0" w:noVBand="0" w:val="0020"/>
-            </w:tblPr>
-            <w:tblGrid>
-              <w:gridCol w:w="3880"/>
-              <w:gridCol w:w="3880"/>
-            </w:tblGrid>
-            <w:tr>
-              <w:trPr>
-                <w:tblHeader w:val="on"/>
-              </w:trPr>
-              <w:tc>
-                <w:tcPr/>
-                <w:p>
-                  <w:pPr>
-                    <w:pStyle w:val="Compact"/>
-                  </w:pPr>
-                </w:p>
-              </w:tc>
-              <w:tc>
-                <w:tcPr/>
-                <w:p>
-                  <w:pPr>
-                    <w:pStyle w:val="Compact"/>
-                  </w:pPr>
-                  <w:r>
-                    <w:t xml:space="preserve">count</w:t>
-                  </w:r>
-                </w:p>
-              </w:tc>
-            </w:tr>
-            <w:tr>
-              <w:trPr>
-                <w:tblHeader w:val="on"/>
-              </w:trPr>
-              <w:tc>
-                <w:tcPr/>
-                <w:p>
-                  <w:pPr>
-                    <w:pStyle w:val="Compact"/>
-                  </w:pPr>
-                  <w:r>
-                    <w:t xml:space="preserve">Employment</w:t>
-                  </w:r>
-                </w:p>
-              </w:tc>
-              <w:tc>
-                <w:tcPr/>
-                <w:p>
-                  <w:pPr>
-                    <w:pStyle w:val="Compact"/>
-                  </w:pPr>
-                </w:p>
-              </w:tc>
-            </w:tr>
-            <w:tr>
-              <w:tc>
-                <w:tcPr/>
-                <w:p>
-                  <w:pPr>
-                    <w:pStyle w:val="Compact"/>
-                  </w:pPr>
-                  <w:r>
-                    <w:t xml:space="preserve">Full-Time Employment</w:t>
-                  </w:r>
-                </w:p>
-              </w:tc>
-              <w:tc>
-                <w:tcPr/>
-                <w:p>
-                  <w:pPr>
-                    <w:pStyle w:val="Compact"/>
-                  </w:pPr>
-                  <w:r>
-                    <w:t xml:space="preserve">154</w:t>
-                  </w:r>
-                </w:p>
-              </w:tc>
-            </w:tr>
-            <w:tr>
-              <w:tc>
-                <w:tcPr/>
-                <w:p>
-                  <w:pPr>
-                    <w:pStyle w:val="Compact"/>
-                  </w:pPr>
-                  <w:r>
-                    <w:t xml:space="preserve">Other Employment Status</w:t>
-                  </w:r>
-                </w:p>
-              </w:tc>
-              <w:tc>
-                <w:tcPr/>
-                <w:p>
-                  <w:pPr>
-                    <w:pStyle w:val="Compact"/>
-                  </w:pPr>
-                  <w:r>
-                    <w:t xml:space="preserve">97</w:t>
-                  </w:r>
-                </w:p>
-              </w:tc>
-            </w:tr>
-            <w:tr>
-              <w:tc>
-                <w:tcPr/>
-                <w:p>
-                  <w:pPr>
-                    <w:pStyle w:val="Compact"/>
-                  </w:pPr>
-                  <w:r>
-                    <w:t xml:space="preserve">Total</w:t>
-                  </w:r>
-                </w:p>
-              </w:tc>
-              <w:tc>
-                <w:tcPr/>
-                <w:p>
-                  <w:pPr>
-                    <w:pStyle w:val="Compact"/>
-                  </w:pPr>
-                  <w:r>
-                    <w:t xml:space="preserve">251</w:t>
-                  </w:r>
-                </w:p>
-              </w:tc>
-            </w:tr>
-          </w:tbl>
-          <w:p/>
-        </w:tc>
-        <w:tc>
-          <w:tcPr/>
+          <w:bookmarkEnd w:id="27"/>
           <w:p/>
         </w:tc>
       </w:tr>
     </w:tbl>
-    <w:p>
-      <w:pPr>
-        <w:pStyle w:val="BodyText"/>
-      </w:pPr>
-      <w:pPr>
-        <w:spacing w:before="200"/>
-        <w:pStyle w:val="ImageCaption"/>
-      </w:pPr>
-      <w:r>
-        <w:t xml:space="preserve">Table 2: Value Counts of Employment Status and Car Access</w:t>
-      </w:r>
-    </w:p>
-    <w:bookmarkEnd w:id="27"/>
     <w:p>
       <w:pPr>
         <w:pStyle w:val="BodyText"/>
@@ -6050,67 +6631,123 @@
       <w:pPr>
         <w:pStyle w:val="BodyText"/>
       </w:pPr>
-      <w:r>
-        <w:rPr>
-          <w:b/>
-          <w:bCs/>
-          <w:i/>
-          <w:iCs/>
-        </w:rPr>
-        <w:t xml:space="preserve">This table is frustrating me because I want some space between the 2 tables and I want them to be side by side</w:t>
+      <w:hyperlink w:anchor="tbl-describe_dataframe">
+        <w:r>
+          <w:rPr>
+            <w:rStyle w:val="Hyperlink"/>
+          </w:rPr>
+          <w:t xml:space="preserve">Table 1</w:t>
+        </w:r>
+      </w:hyperlink>
+      <w:r>
+        <w:t xml:space="preserve"> </w:t>
+      </w:r>
+      <w:r>
+        <w:t xml:space="preserve">give general descriptive statistics of the numeric values of the data, with the mean Total Ride Days per Month equal to 3.63.</w:t>
       </w:r>
     </w:p>
     <w:p>
       <w:pPr>
         <w:pStyle w:val="BodyText"/>
       </w:pPr>
-      <w:r>
-        <w:rPr>
-          <w:b/>
-          <w:bCs/>
-          <w:i/>
-          <w:iCs/>
-        </w:rPr>
-        <w:t xml:space="preserve">Eventually I want</w:t>
-      </w:r>
-      <w:r>
-        <w:rPr>
-          <w:b/>
-          <w:bCs/>
-          <w:i/>
-          <w:iCs/>
-        </w:rPr>
+      <w:hyperlink w:anchor="fig-histograms">
+        <w:r>
+          <w:rPr>
+            <w:rStyle w:val="Hyperlink"/>
+          </w:rPr>
+          <w:t xml:space="preserve">Figure 1</w:t>
+        </w:r>
+      </w:hyperlink>
+      <w:r>
         <w:t xml:space="preserve"> </w:t>
       </w:r>
+      <w:r>
+        <w:t xml:space="preserve">shows the distribution of total ride days per month. This is a uniform distribution and should be noted.</w:t>
+      </w:r>
+    </w:p>
+    <w:p>
+      <w:pPr>
+        <w:pStyle w:val="BodyText"/>
+      </w:pPr>
       <w:hyperlink w:anchor="fig-barplot">
         <w:r>
           <w:rPr>
             <w:rStyle w:val="Hyperlink"/>
-            <w:b/>
-            <w:bCs/>
-            <w:i/>
-            <w:iCs/>
           </w:rPr>
           <w:t xml:space="preserve">Figure 2</w:t>
         </w:r>
       </w:hyperlink>
       <w:r>
-        <w:rPr>
-          <w:b/>
-          <w:bCs/>
-          <w:i/>
-          <w:iCs/>
-        </w:rPr>
         <w:t xml:space="preserve"> </w:t>
       </w:r>
       <w:r>
-        <w:rPr>
-          <w:b/>
-          <w:bCs/>
-          <w:i/>
-          <w:iCs/>
-        </w:rPr>
-        <w:t xml:space="preserve">and these tables to be in a tab set of some sort so you can click on it, but its just not working</w:t>
+        <w:t xml:space="preserve">depicts the counts of participants by employment status and vehicle access and</w:t>
+      </w:r>
+      <w:r>
+        <w:t xml:space="preserve"> </w:t>
+      </w:r>
+      <w:hyperlink w:anchor="tbl-cross-tab">
+        <w:r>
+          <w:rPr>
+            <w:rStyle w:val="Hyperlink"/>
+          </w:rPr>
+          <w:t xml:space="preserve">Table 2</w:t>
+        </w:r>
+      </w:hyperlink>
+      <w:r>
+        <w:t xml:space="preserve"> </w:t>
+      </w:r>
+      <w:r>
+        <w:t xml:space="preserve">shows the actual value counts. It should be noted that there are missing values in the data, specifically for the</w:t>
+      </w:r>
+      <w:r>
+        <w:t xml:space="preserve"> </w:t>
+      </w:r>
+      <w:r>
+        <w:rPr>
+          <w:rStyle w:val="VerbatimChar"/>
+        </w:rPr>
+        <w:t xml:space="preserve">Car Access</w:t>
+      </w:r>
+      <w:r>
+        <w:t xml:space="preserve"> </w:t>
+      </w:r>
+      <w:r>
+        <w:t xml:space="preserve">variable, so that is the reason for the different total values.</w:t>
+      </w:r>
+    </w:p>
+    <w:p>
+      <w:pPr>
+        <w:pStyle w:val="BodyText"/>
+      </w:pPr>
+      <w:hyperlink w:anchor="tbl-groupby">
+        <w:r>
+          <w:rPr>
+            <w:rStyle w:val="Hyperlink"/>
+          </w:rPr>
+          <w:t xml:space="preserve">Table 3</w:t>
+        </w:r>
+      </w:hyperlink>
+      <w:r>
+        <w:t xml:space="preserve"> </w:t>
+      </w:r>
+      <w:r>
+        <w:t xml:space="preserve">shows the descriptive statistics of my dependent variable</w:t>
+      </w:r>
+      <w:r>
+        <w:t xml:space="preserve"> </w:t>
+      </w:r>
+      <w:r>
+        <w:rPr>
+          <w:rStyle w:val="VerbatimChar"/>
+        </w:rPr>
+        <w:t xml:space="preserve">total_rides</w:t>
+      </w:r>
+      <w:r>
+        <w:t xml:space="preserve"> </w:t>
+      </w:r>
+      <w:r>
+        <w:t xml:space="preserve">by employment status and vehicle access.</w:t>
       </w:r>
     </w:p>
     <w:p>
@@ -6845,157 +7482,33 @@
         </w:r>
       </w:hyperlink>
     </w:p>
-    <w:bookmarkStart w:id="29" w:name="model-create-python"/>
+    <w:bookmarkEnd w:id="29"/>
+    <w:bookmarkStart w:id="30" w:name="methods"/>
     <w:p>
       <w:pPr>
-        <w:pStyle w:val="SourceCode"/>
+        <w:pStyle w:val="Heading2"/>
       </w:pPr>
       <w:r>
-        <w:rPr>
-          <w:rStyle w:val="CommentTok"/>
-        </w:rPr>
-        <w:t xml:space="preserve"># Create the ANOVA model (using Q() for column names with special characters)</w:t>
-      </w:r>
-      <w:r>
-        <w:br/>
-      </w:r>
-      <w:r>
-        <w:rPr>
-          <w:rStyle w:val="NormalTok"/>
-        </w:rPr>
-        <w:t xml:space="preserve">df[</w:t>
-      </w:r>
-      <w:r>
-        <w:rPr>
-          <w:rStyle w:val="StringTok"/>
-        </w:rPr>
-        <w:t xml:space="preserve">'full_time'</w:t>
-      </w:r>
-      <w:r>
-        <w:rPr>
-          <w:rStyle w:val="NormalTok"/>
-        </w:rPr>
-        <w:t xml:space="preserve">] </w:t>
-      </w:r>
-      <w:r>
-        <w:rPr>
-          <w:rStyle w:val="OperatorTok"/>
-        </w:rPr>
-        <w:t xml:space="preserve">=</w:t>
-      </w:r>
-      <w:r>
-        <w:rPr>
-          <w:rStyle w:val="NormalTok"/>
-        </w:rPr>
-        <w:t xml:space="preserve"> df[</w:t>
-      </w:r>
-      <w:r>
-        <w:rPr>
-          <w:rStyle w:val="StringTok"/>
-        </w:rPr>
-        <w:t xml:space="preserve">'Full-Time'</w:t>
-      </w:r>
-      <w:r>
-        <w:rPr>
-          <w:rStyle w:val="NormalTok"/>
-        </w:rPr>
-        <w:t xml:space="preserve">]</w:t>
-      </w:r>
-      <w:r>
-        <w:br/>
-      </w:r>
-      <w:r>
-        <w:rPr>
-          <w:rStyle w:val="NormalTok"/>
-        </w:rPr>
-        <w:t xml:space="preserve">df[</w:t>
-      </w:r>
-      <w:r>
-        <w:rPr>
-          <w:rStyle w:val="StringTok"/>
-        </w:rPr>
-        <w:t xml:space="preserve">'car_access'</w:t>
-      </w:r>
-      <w:r>
-        <w:rPr>
-          <w:rStyle w:val="NormalTok"/>
-        </w:rPr>
-        <w:t xml:space="preserve">] </w:t>
-      </w:r>
-      <w:r>
-        <w:rPr>
-          <w:rStyle w:val="OperatorTok"/>
-        </w:rPr>
-        <w:t xml:space="preserve">=</w:t>
-      </w:r>
-      <w:r>
-        <w:rPr>
-          <w:rStyle w:val="NormalTok"/>
-        </w:rPr>
-        <w:t xml:space="preserve"> df[</w:t>
-      </w:r>
-      <w:r>
-        <w:rPr>
-          <w:rStyle w:val="StringTok"/>
-        </w:rPr>
-        <w:t xml:space="preserve">'Car Access'</w:t>
-      </w:r>
-      <w:r>
-        <w:rPr>
-          <w:rStyle w:val="NormalTok"/>
-        </w:rPr>
-        <w:t xml:space="preserve">]</w:t>
-      </w:r>
-      <w:r>
-        <w:br/>
-      </w:r>
-      <w:r>
-        <w:br/>
-      </w:r>
-      <w:r>
-        <w:br/>
-      </w:r>
-      <w:r>
-        <w:rPr>
-          <w:rStyle w:val="NormalTok"/>
-        </w:rPr>
-        <w:t xml:space="preserve">model </w:t>
-      </w:r>
-      <w:r>
-        <w:rPr>
-          <w:rStyle w:val="OperatorTok"/>
-        </w:rPr>
-        <w:t xml:space="preserve">=</w:t>
-      </w:r>
-      <w:r>
-        <w:rPr>
-          <w:rStyle w:val="NormalTok"/>
-        </w:rPr>
-        <w:t xml:space="preserve"> ols(</w:t>
-      </w:r>
-      <w:r>
-        <w:rPr>
-          <w:rStyle w:val="StringTok"/>
-        </w:rPr>
-        <w:t xml:space="preserve">'total_rides ~ C(full_time) + C(car_access)'</w:t>
-      </w:r>
-      <w:r>
-        <w:rPr>
-          <w:rStyle w:val="NormalTok"/>
-        </w:rPr>
-        <w:t xml:space="preserve">, data</w:t>
-      </w:r>
-      <w:r>
-        <w:rPr>
-          <w:rStyle w:val="OperatorTok"/>
-        </w:rPr>
-        <w:t xml:space="preserve">=</w:t>
-      </w:r>
-      <w:r>
-        <w:rPr>
-          <w:rStyle w:val="NormalTok"/>
-        </w:rPr>
-        <w:t xml:space="preserve">df).fit()</w:t>
+        <w:t xml:space="preserve">Methods</w:t>
+      </w:r>
+    </w:p>
+    <w:p>
+      <w:pPr>
+        <w:pStyle w:val="FirstParagraph"/>
+      </w:pPr>
+      <w:r>
+        <w:t xml:space="preserve">I conducted a 2x2 ANOVA to examine the effects of employment status and vehicle access on the total number of rides.</w:t>
+      </w:r>
+    </w:p>
+    <w:bookmarkEnd w:id="30"/>
+    <w:bookmarkEnd w:id="31"/>
+    <w:bookmarkStart w:id="39" w:name="results"/>
+    <w:p>
+      <w:pPr>
+        <w:pStyle w:val="Heading1"/>
+      </w:pPr>
+      <w:r>
+        <w:t xml:space="preserve">Results</w:t>
       </w:r>
     </w:p>
     <w:p>
@@ -7024,7 +7537,7 @@
         </w:r>
       </w:hyperlink>
     </w:p>
-    <w:bookmarkEnd w:id="29"/>
+    <w:bookmarkStart w:id="32" w:name="model-create-python"/>
     <w:p>
       <w:pPr>
         <w:pStyle w:val="SourceCode"/>
@@ -7033,6 +7546,185 @@
         <w:rPr>
           <w:rStyle w:val="CommentTok"/>
         </w:rPr>
+        <w:t xml:space="preserve"># Create the ANOVA model (using Q() for column names with special characters)</w:t>
+      </w:r>
+      <w:r>
+        <w:br/>
+      </w:r>
+      <w:r>
+        <w:rPr>
+          <w:rStyle w:val="NormalTok"/>
+        </w:rPr>
+        <w:t xml:space="preserve">df[</w:t>
+      </w:r>
+      <w:r>
+        <w:rPr>
+          <w:rStyle w:val="StringTok"/>
+        </w:rPr>
+        <w:t xml:space="preserve">'full_time'</w:t>
+      </w:r>
+      <w:r>
+        <w:rPr>
+          <w:rStyle w:val="NormalTok"/>
+        </w:rPr>
+        <w:t xml:space="preserve">] </w:t>
+      </w:r>
+      <w:r>
+        <w:rPr>
+          <w:rStyle w:val="OperatorTok"/>
+        </w:rPr>
+        <w:t xml:space="preserve">=</w:t>
+      </w:r>
+      <w:r>
+        <w:rPr>
+          <w:rStyle w:val="NormalTok"/>
+        </w:rPr>
+        <w:t xml:space="preserve"> df[</w:t>
+      </w:r>
+      <w:r>
+        <w:rPr>
+          <w:rStyle w:val="StringTok"/>
+        </w:rPr>
+        <w:t xml:space="preserve">'Full-Time'</w:t>
+      </w:r>
+      <w:r>
+        <w:rPr>
+          <w:rStyle w:val="NormalTok"/>
+        </w:rPr>
+        <w:t xml:space="preserve">]</w:t>
+      </w:r>
+      <w:r>
+        <w:br/>
+      </w:r>
+      <w:r>
+        <w:rPr>
+          <w:rStyle w:val="NormalTok"/>
+        </w:rPr>
+        <w:t xml:space="preserve">df[</w:t>
+      </w:r>
+      <w:r>
+        <w:rPr>
+          <w:rStyle w:val="StringTok"/>
+        </w:rPr>
+        <w:t xml:space="preserve">'car_access'</w:t>
+      </w:r>
+      <w:r>
+        <w:rPr>
+          <w:rStyle w:val="NormalTok"/>
+        </w:rPr>
+        <w:t xml:space="preserve">] </w:t>
+      </w:r>
+      <w:r>
+        <w:rPr>
+          <w:rStyle w:val="OperatorTok"/>
+        </w:rPr>
+        <w:t xml:space="preserve">=</w:t>
+      </w:r>
+      <w:r>
+        <w:rPr>
+          <w:rStyle w:val="NormalTok"/>
+        </w:rPr>
+        <w:t xml:space="preserve"> df[</w:t>
+      </w:r>
+      <w:r>
+        <w:rPr>
+          <w:rStyle w:val="StringTok"/>
+        </w:rPr>
+        <w:t xml:space="preserve">'Car Access'</w:t>
+      </w:r>
+      <w:r>
+        <w:rPr>
+          <w:rStyle w:val="NormalTok"/>
+        </w:rPr>
+        <w:t xml:space="preserve">]</w:t>
+      </w:r>
+      <w:r>
+        <w:br/>
+      </w:r>
+      <w:r>
+        <w:br/>
+      </w:r>
+      <w:r>
+        <w:br/>
+      </w:r>
+      <w:r>
+        <w:rPr>
+          <w:rStyle w:val="NormalTok"/>
+        </w:rPr>
+        <w:t xml:space="preserve">model </w:t>
+      </w:r>
+      <w:r>
+        <w:rPr>
+          <w:rStyle w:val="OperatorTok"/>
+        </w:rPr>
+        <w:t xml:space="preserve">=</w:t>
+      </w:r>
+      <w:r>
+        <w:rPr>
+          <w:rStyle w:val="NormalTok"/>
+        </w:rPr>
+        <w:t xml:space="preserve"> ols(</w:t>
+      </w:r>
+      <w:r>
+        <w:rPr>
+          <w:rStyle w:val="StringTok"/>
+        </w:rPr>
+        <w:t xml:space="preserve">'total_rides ~ C(full_time) + C(car_access)'</w:t>
+      </w:r>
+      <w:r>
+        <w:rPr>
+          <w:rStyle w:val="NormalTok"/>
+        </w:rPr>
+        <w:t xml:space="preserve">, data</w:t>
+      </w:r>
+      <w:r>
+        <w:rPr>
+          <w:rStyle w:val="OperatorTok"/>
+        </w:rPr>
+        <w:t xml:space="preserve">=</w:t>
+      </w:r>
+      <w:r>
+        <w:rPr>
+          <w:rStyle w:val="NormalTok"/>
+        </w:rPr>
+        <w:t xml:space="preserve">df).fit()</w:t>
+      </w:r>
+    </w:p>
+    <w:p>
+      <w:pPr>
+        <w:pStyle w:val="FirstParagraph"/>
+      </w:pPr>
+      <w:r>
+        <w:rPr>
+          <w:vertAlign w:val="subscript"/>
+        </w:rPr>
+        <w:t xml:space="preserve">Source:</w:t>
+      </w:r>
+      <w:r>
+        <w:rPr>
+          <w:vertAlign w:val="subscript"/>
+        </w:rPr>
+        <w:t xml:space="preserve"> </w:t>
+      </w:r>
+      <w:hyperlink r:id="rId10">
+        <w:r>
+          <w:rPr>
+            <w:rStyle w:val="Hyperlink"/>
+            <w:vertAlign w:val="subscript"/>
+          </w:rPr>
+          <w:t xml:space="preserve">Article Notebook</w:t>
+        </w:r>
+      </w:hyperlink>
+    </w:p>
+    <w:bookmarkEnd w:id="32"/>
+    <w:p>
+      <w:pPr>
+        <w:pStyle w:val="SourceCode"/>
+      </w:pPr>
+      <w:r>
+        <w:rPr>
+          <w:rStyle w:val="CommentTok"/>
+        </w:rPr>
         <w:t xml:space="preserve"># Get the ANOVA table</w:t>
       </w:r>
       <w:r>
@@ -7106,9 +7798,69 @@
       </w:r>
       <w:r>
         <w:rPr>
-          <w:rStyle w:val="CommentTok"/>
-        </w:rPr>
-        <w:t xml:space="preserve"># anova_table.index = ['Intercept','Full-Time', 'Car Access']</w:t>
+          <w:rStyle w:val="NormalTok"/>
+        </w:rPr>
+        <w:t xml:space="preserve">anova_table.index </w:t>
+      </w:r>
+      <w:r>
+        <w:rPr>
+          <w:rStyle w:val="OperatorTok"/>
+        </w:rPr>
+        <w:t xml:space="preserve">=</w:t>
+      </w:r>
+      <w:r>
+        <w:rPr>
+          <w:rStyle w:val="NormalTok"/>
+        </w:rPr>
+        <w:t xml:space="preserve"> [</w:t>
+      </w:r>
+      <w:r>
+        <w:rPr>
+          <w:rStyle w:val="StringTok"/>
+        </w:rPr>
+        <w:t xml:space="preserve">'Intercept'</w:t>
+      </w:r>
+      <w:r>
+        <w:rPr>
+          <w:rStyle w:val="NormalTok"/>
+        </w:rPr>
+        <w:t xml:space="preserve">,</w:t>
+      </w:r>
+      <w:r>
+        <w:rPr>
+          <w:rStyle w:val="StringTok"/>
+        </w:rPr>
+        <w:t xml:space="preserve">'Full-Time'</w:t>
+      </w:r>
+      <w:r>
+        <w:rPr>
+          <w:rStyle w:val="NormalTok"/>
+        </w:rPr>
+        <w:t xml:space="preserve">, </w:t>
+      </w:r>
+      <w:r>
+        <w:rPr>
+          <w:rStyle w:val="StringTok"/>
+        </w:rPr>
+        <w:t xml:space="preserve">'Car Access'</w:t>
+      </w:r>
+      <w:r>
+        <w:rPr>
+          <w:rStyle w:val="NormalTok"/>
+        </w:rPr>
+        <w:t xml:space="preserve">, </w:t>
+      </w:r>
+      <w:r>
+        <w:rPr>
+          <w:rStyle w:val="StringTok"/>
+        </w:rPr>
+        <w:t xml:space="preserve">'Residual'</w:t>
+      </w:r>
+      <w:r>
+        <w:rPr>
+          <w:rStyle w:val="NormalTok"/>
+        </w:rPr>
+        <w:t xml:space="preserve">]</w:t>
       </w:r>
       <w:r>
         <w:br/>
@@ -7145,7 +7897,7 @@
       <w:tr>
         <w:tc>
           <w:tcPr/>
-          <w:bookmarkStart w:id="30" w:name="tbl-anova"/>
+          <w:bookmarkStart w:id="33" w:name="tbl-anova"/>
           <w:p>
             <w:pPr>
               <w:jc w:val="center"/>
@@ -7304,7 +8056,7 @@
                     <w:jc w:val="center"/>
                   </w:pPr>
                   <w:r>
-                    <w:t xml:space="preserve">C(full_time)</w:t>
+                    <w:t xml:space="preserve">Full-Time</w:t>
                   </w:r>
                 </w:p>
               </w:tc>
@@ -7366,7 +8118,7 @@
                     <w:jc w:val="center"/>
                   </w:pPr>
                   <w:r>
-                    <w:t xml:space="preserve">C(car_access)</w:t>
+                    <w:t xml:space="preserve">Car Access</w:t>
                   </w:r>
                 </w:p>
               </w:tc>
@@ -7482,7 +8234,7 @@
               </w:tc>
             </w:tr>
           </w:tbl>
-          <w:bookmarkEnd w:id="30"/>
+          <w:bookmarkEnd w:id="33"/>
           <w:p/>
         </w:tc>
       </w:tr>
@@ -7911,7 +8663,7 @@
       <w:tr>
         <w:tc>
           <w:tcPr/>
-          <w:bookmarkStart w:id="31" w:name="tbl-parameter-estimates"/>
+          <w:bookmarkStart w:id="34" w:name="tbl-parameter-estimates"/>
           <w:p>
             <w:pPr>
               <w:jc w:val="center"/>
@@ -8186,7 +8938,7 @@
               </w:tc>
             </w:tr>
           </w:tbl>
-          <w:bookmarkEnd w:id="31"/>
+          <w:bookmarkEnd w:id="34"/>
           <w:p/>
         </w:tc>
       </w:tr>
@@ -8222,73 +8974,233 @@
         <w:pStyle w:val="BodyText"/>
       </w:pPr>
       <w:r>
-        <w:t xml:space="preserve">I need to change the variable names for theoparameter estimates table and then I will</w:t>
+        <w:t xml:space="preserve">There is a significant main effect of</w:t>
       </w:r>
       <w:r>
         <w:t xml:space="preserve"> </w:t>
       </w:r>
       <w:r>
         <w:rPr>
-          <w:b/>
-          <w:bCs/>
-        </w:rPr>
-        <w:t xml:space="preserve">REFER</w:t>
+          <w:rStyle w:val="VerbatimChar"/>
+        </w:rPr>
+        <w:t xml:space="preserve">Full-Time</w:t>
       </w:r>
       <w:r>
         <w:t xml:space="preserve"> </w:t>
       </w:r>
       <w:r>
-        <w:t xml:space="preserve">to the values created in the tables above</w:t>
+        <w:t xml:space="preserve">on</w:t>
+      </w:r>
+      <w:r>
+        <w:t xml:space="preserve"> </w:t>
+      </w:r>
+      <w:r>
+        <w:rPr>
+          <w:rStyle w:val="VerbatimChar"/>
+        </w:rPr>
+        <w:t xml:space="preserve">total_rides</w:t>
+      </w:r>
+      <w:r>
+        <w:t xml:space="preserve"> </w:t>
+      </w:r>
+      <w:r>
+        <w:t xml:space="preserve">(</w:t>
+      </w:r>
+      <m:oMath>
+        <m:r>
+          <m:t>F</m:t>
+        </m:r>
+        <m:r>
+          <m:rPr>
+            <m:sty m:val="p"/>
+          </m:rPr>
+          <m:t>(</m:t>
+        </m:r>
+        <m:r>
+          <m:t>1</m:t>
+        </m:r>
+        <m:r>
+          <m:rPr>
+            <m:sty m:val="p"/>
+          </m:rPr>
+          <m:t>,</m:t>
+        </m:r>
+        <m:r>
+          <m:t>149</m:t>
+        </m:r>
+        <m:r>
+          <m:rPr>
+            <m:sty m:val="p"/>
+          </m:rPr>
+          <m:t>)</m:t>
+        </m:r>
+        <m:r>
+          <m:rPr>
+            <m:sty m:val="p"/>
+          </m:rPr>
+          <m:t>=</m:t>
+        </m:r>
+        <m:r>
+          <m:t>12.18</m:t>
+        </m:r>
+      </m:oMath>
+      <w:r>
+        <w:t xml:space="preserve">,</w:t>
+      </w:r>
+      <w:r>
+        <w:t xml:space="preserve"> </w:t>
+      </w:r>
+      <m:oMath>
+        <m:r>
+          <m:t>p</m:t>
+        </m:r>
+        <m:r>
+          <m:rPr>
+            <m:sty m:val="p"/>
+          </m:rPr>
+          <m:t>&lt;</m:t>
+        </m:r>
+        <m:r>
+          <m:t>0.001</m:t>
+        </m:r>
+      </m:oMath>
+      <w:r>
+        <w:t xml:space="preserve">), such that full-time employees have significantly more total ride days per month than other employees.</w:t>
       </w:r>
     </w:p>
     <w:p>
       <w:pPr>
         <w:pStyle w:val="BodyText"/>
       </w:pPr>
-      <w:hyperlink w:anchor="tbl-describe_dataframe">
-        <w:r>
-          <w:rPr>
-            <w:rStyle w:val="Hyperlink"/>
-          </w:rPr>
-          <w:t xml:space="preserve">Table 1</w:t>
-        </w:r>
-      </w:hyperlink>
+      <w:r>
+        <w:t xml:space="preserve">There is a significant main effect of</w:t>
+      </w:r>
       <w:r>
         <w:t xml:space="preserve"> </w:t>
       </w:r>
       <w:r>
-        <w:t xml:space="preserve">give general descriptive statistics of the numeric values of the data.</w:t>
+        <w:rPr>
+          <w:rStyle w:val="VerbatimChar"/>
+        </w:rPr>
+        <w:t xml:space="preserve">Car Access</w:t>
+      </w:r>
+      <w:r>
+        <w:t xml:space="preserve"> </w:t>
+      </w:r>
+      <w:r>
+        <w:t xml:space="preserve">on</w:t>
+      </w:r>
+      <w:r>
+        <w:t xml:space="preserve"> </w:t>
+      </w:r>
+      <w:r>
+        <w:rPr>
+          <w:rStyle w:val="VerbatimChar"/>
+        </w:rPr>
+        <w:t xml:space="preserve">total_rides</w:t>
+      </w:r>
+      <w:r>
+        <w:t xml:space="preserve"> </w:t>
+      </w:r>
+      <w:r>
+        <w:t xml:space="preserve">(</w:t>
+      </w:r>
+      <m:oMath>
+        <m:r>
+          <m:t>F</m:t>
+        </m:r>
+        <m:r>
+          <m:rPr>
+            <m:sty m:val="p"/>
+          </m:rPr>
+          <m:t>(</m:t>
+        </m:r>
+        <m:r>
+          <m:t>1</m:t>
+        </m:r>
+        <m:r>
+          <m:rPr>
+            <m:sty m:val="p"/>
+          </m:rPr>
+          <m:t>,</m:t>
+        </m:r>
+        <m:r>
+          <m:t>149</m:t>
+        </m:r>
+        <m:r>
+          <m:rPr>
+            <m:sty m:val="p"/>
+          </m:rPr>
+          <m:t>)</m:t>
+        </m:r>
+        <m:r>
+          <m:rPr>
+            <m:sty m:val="p"/>
+          </m:rPr>
+          <m:t>=</m:t>
+        </m:r>
+        <m:r>
+          <m:t>15.69</m:t>
+        </m:r>
+      </m:oMath>
+      <w:r>
+        <w:t xml:space="preserve">,</w:t>
+      </w:r>
+      <w:r>
+        <w:t xml:space="preserve"> </w:t>
+      </w:r>
+      <m:oMath>
+        <m:r>
+          <m:t>p</m:t>
+        </m:r>
+        <m:r>
+          <m:rPr>
+            <m:sty m:val="p"/>
+          </m:rPr>
+          <m:t>&lt;</m:t>
+        </m:r>
+        <m:r>
+          <m:t>0.0</m:t>
+        </m:r>
+      </m:oMath>
+      <w:r>
+        <w:t xml:space="preserve">), such that individuals with car access have significantly less total ride days per month than other employees.</w:t>
       </w:r>
     </w:p>
     <w:p>
       <w:pPr>
         <w:pStyle w:val="BodyText"/>
       </w:pPr>
-      <w:hyperlink w:anchor="tbl-groupby">
+      <w:r>
+        <w:t xml:space="preserve">The parameter estimates refered to in</w:t>
+      </w:r>
+      <w:r>
+        <w:t xml:space="preserve"> </w:t>
+      </w:r>
+      <w:hyperlink w:anchor="tbl-parameter-estimates">
         <w:r>
           <w:rPr>
             <w:rStyle w:val="Hyperlink"/>
           </w:rPr>
-          <w:t xml:space="preserve">Table 3</w:t>
+          <w:t xml:space="preserve">Table 5</w:t>
         </w:r>
       </w:hyperlink>
       <w:r>
         <w:t xml:space="preserve"> </w:t>
       </w:r>
       <w:r>
-        <w:t xml:space="preserve">shows the descriptive statistics of my dependent variable</w:t>
-      </w:r>
-      <w:r>
-        <w:t xml:space="preserve"> </w:t>
-      </w:r>
-      <w:r>
-        <w:t xml:space="preserve">‘total_rides’</w:t>
-      </w:r>
-      <w:r>
-        <w:t xml:space="preserve"> </w:t>
-      </w:r>
-      <w:r>
-        <w:t xml:space="preserve">by employment status and vehicle access.</w:t>
+        <w:t xml:space="preserve">are not interpretable due to converting total ride days per month from a categorical variable to a numerical variable. This is discussed in the limitations section (</w:t>
+      </w:r>
+      <w:hyperlink w:anchor="sec-limitations">
+        <w:r>
+          <w:rPr>
+            <w:rStyle w:val="Hyperlink"/>
+          </w:rPr>
+          <w:t xml:space="preserve">Section 4.2</w:t>
+        </w:r>
+      </w:hyperlink>
+      <w:r>
+        <w:t xml:space="preserve">).</w:t>
       </w:r>
     </w:p>
     <w:p>
@@ -8578,7 +9490,7 @@
       <w:tr>
         <w:tc>
           <w:tcPr/>
-          <w:bookmarkStart w:id="35" w:name="fig-boxplot"/>
+          <w:bookmarkStart w:id="38" w:name="fig-boxplot"/>
           <w:p>
             <w:pPr>
               <w:pStyle w:val="Compact"/>
@@ -8589,18 +9501,18 @@
                 <wp:inline>
                   <wp:extent cx="5334000" cy="2802745"/>
                   <wp:effectExtent b="0" l="0" r="0" t="0"/>
-                  <wp:docPr descr="" title="" id="33" name="Picture"/>
+                  <wp:docPr descr="" title="" id="36" name="Picture"/>
                   <a:graphic>
                     <a:graphicData uri="http://schemas.openxmlformats.org/drawingml/2006/picture">
                       <pic:pic>
                         <pic:nvPicPr>
-                          <pic:cNvPr descr="index_files/figure-docx/fig-boxplot-output-1.png" id="34" name="Picture"/>
+                          <pic:cNvPr descr="index_files/figure-docx/fig-boxplot-output-1.png" id="37" name="Picture"/>
                           <pic:cNvPicPr>
                             <a:picLocks noChangeArrowheads="1" noChangeAspect="1"/>
                           </pic:cNvPicPr>
                         </pic:nvPicPr>
                         <pic:blipFill>
-                          <a:blip r:embed="rId32"/>
+                          <a:blip r:embed="rId35"/>
                           <a:stretch>
                             <a:fillRect/>
                           </a:stretch>
@@ -8640,7 +9552,7 @@
               <w:t xml:space="preserve">Figure 3: Boxplot of total rides by employment status and vehicle access</w:t>
             </w:r>
           </w:p>
-          <w:bookmarkEnd w:id="35"/>
+          <w:bookmarkEnd w:id="38"/>
         </w:tc>
       </w:tr>
     </w:tbl>
@@ -8670,9 +9582,8 @@
         </w:r>
       </w:hyperlink>
     </w:p>
-    <w:bookmarkEnd w:id="36"/>
-    <w:bookmarkEnd w:id="37"/>
-    <w:bookmarkStart w:id="43" w:name="conclusion-future-directions-limitations"/>
+    <w:bookmarkEnd w:id="39"/>
+    <w:bookmarkStart w:id="45" w:name="conclusion-future-directions-limitations"/>
     <w:p>
       <w:pPr>
         <w:pStyle w:val="Heading1"/>
@@ -8681,7 +9592,7 @@
         <w:t xml:space="preserve">Conclusion, Future Directions, &amp; Limitations</w:t>
       </w:r>
     </w:p>
-    <w:bookmarkStart w:id="38" w:name="future-directions"/>
+    <w:bookmarkStart w:id="40" w:name="future-directions"/>
     <w:p>
       <w:pPr>
         <w:pStyle w:val="Heading2"/>
@@ -8712,8 +9623,8 @@
         <w:t xml:space="preserve">, there appears to be an outlier that is a full-time employee without access to a car with very low ride share and public transportation usage days. It would be interesting to further examine this outlier; however, it seems to be this person may walk to work or work from home.</w:t>
       </w:r>
     </w:p>
-    <w:bookmarkEnd w:id="38"/>
-    <w:bookmarkStart w:id="42" w:name="limitations"/>
+    <w:bookmarkEnd w:id="40"/>
+    <w:bookmarkStart w:id="44" w:name="sec-limitations"/>
     <w:p>
       <w:pPr>
         <w:pStyle w:val="Heading2"/>
@@ -8874,8 +9785,8 @@
         </w:r>
       </w:hyperlink>
     </w:p>
-    <w:bookmarkStart w:id="41" w:name="refs"/>
-    <w:bookmarkStart w:id="40" w:name="ref-Yang2015"/>
+    <w:bookmarkStart w:id="43" w:name="refs"/>
+    <w:bookmarkStart w:id="42" w:name="ref-Yang2015"/>
     <w:p>
       <w:pPr>
         <w:pStyle w:val="Bibliography"/>
@@ -8905,7 +9816,7 @@
       <w:r>
         <w:t xml:space="preserve">2 (2): 212–18. https://doi.org/</w:t>
       </w:r>
-      <w:hyperlink r:id="rId39">
+      <w:hyperlink r:id="rId41">
         <w:r>
           <w:rPr>
             <w:rStyle w:val="Hyperlink"/>
@@ -8917,10 +9828,10 @@
         <w:t xml:space="preserve">.</w:t>
       </w:r>
     </w:p>
-    <w:bookmarkEnd w:id="40"/>
-    <w:bookmarkEnd w:id="41"/>
     <w:bookmarkEnd w:id="42"/>
     <w:bookmarkEnd w:id="43"/>
+    <w:bookmarkEnd w:id="44"/>
+    <w:bookmarkEnd w:id="45"/>
     <w:sectPr>
       <w:footnotePr>
         <w:numRestart w:val="eachSect"/>

</xml_diff>